<commit_message>
avances en puntos del informe (revisar)
</commit_message>
<xml_diff>
--- a/DSY1104 Evaluación Parcial 1 - Anexo 4 ERS-Especificacion de Requisitos del software.docx
+++ b/DSY1104 Evaluación Parcial 1 - Anexo 4 ERS-Especificacion de Requisitos del software.docx
@@ -69,7 +69,6 @@
             <w:pPr>
               <w:keepNext w:val="0"/>
               <w:keepLines w:val="0"/>
-              <w:pageBreakBefore w:val="0"/>
               <w:widowControl w:val="1"/>
               <w:pBdr>
                 <w:top w:space="0" w:sz="0" w:val="nil"/>
@@ -137,7 +136,6 @@
             <w:pPr>
               <w:keepNext w:val="0"/>
               <w:keepLines w:val="0"/>
-              <w:pageBreakBefore w:val="0"/>
               <w:widowControl w:val="1"/>
               <w:pBdr>
                 <w:top w:space="0" w:sz="0" w:val="nil"/>
@@ -205,7 +203,6 @@
             <w:pPr>
               <w:keepNext w:val="0"/>
               <w:keepLines w:val="0"/>
-              <w:pageBreakBefore w:val="0"/>
               <w:widowControl w:val="1"/>
               <w:pBdr>
                 <w:top w:space="0" w:sz="0" w:val="nil"/>
@@ -285,7 +282,6 @@
             <w:pPr>
               <w:keepNext w:val="0"/>
               <w:keepLines w:val="0"/>
-              <w:pageBreakBefore w:val="0"/>
               <w:widowControl w:val="1"/>
               <w:pBdr>
                 <w:top w:space="0" w:sz="0" w:val="nil"/>
@@ -336,7 +332,6 @@
             <w:pPr>
               <w:keepNext w:val="0"/>
               <w:keepLines w:val="0"/>
-              <w:pageBreakBefore w:val="0"/>
               <w:widowControl w:val="1"/>
               <w:pBdr>
                 <w:top w:space="0" w:sz="0" w:val="nil"/>
@@ -427,7 +422,6 @@
             <w:pPr>
               <w:keepNext w:val="0"/>
               <w:keepLines w:val="0"/>
-              <w:pageBreakBefore w:val="0"/>
               <w:widowControl w:val="1"/>
               <w:pBdr>
                 <w:top w:space="0" w:sz="0" w:val="nil"/>
@@ -530,7 +524,6 @@
             <w:pPr>
               <w:keepNext w:val="0"/>
               <w:keepLines w:val="0"/>
-              <w:pageBreakBefore w:val="0"/>
               <w:widowControl w:val="1"/>
               <w:pBdr>
                 <w:top w:space="0" w:sz="0" w:val="nil"/>
@@ -698,7 +691,7 @@
     </w:p>
     <w:sdt>
       <w:sdtPr>
-        <w:id w:val="968740592"/>
+        <w:id w:val="691881148"/>
         <w:docPartObj>
           <w:docPartGallery w:val="Table of Contents"/>
           <w:docPartUnique w:val="1"/>
@@ -5275,19 +5268,7 @@
         <w:rPr>
           <w:rtl w:val="0"/>
         </w:rPr>
-        <w:t xml:space="preserve">Lo que el sistema no hará: no </w:t>
-      </w:r>
-      <w:r>
-        <w:rPr>
-          <w:rtl w:val="0"/>
-        </w:rPr>
-        <w:t xml:space="preserve">procesará</w:t>
-      </w:r>
-      <w:r>
-        <w:rPr>
-          <w:rtl w:val="0"/>
-        </w:rPr>
-        <w:t xml:space="preserve"> pagos en línea reales ni se integrará con una pasarela de pago, y no implementará backend ni base de datos (la información se simulará mediante arreglos en JavaScript y localStorage).</w:t>
+        <w:t xml:space="preserve">Lo que el sistema no hará: no procesará pagos en línea reales ni se integrará con una pasarela de pago, y no implementará backend ni base de datos (la información se simulará mediante arreglos en JavaScript y localStorage).</w:t>
       </w:r>
     </w:p>
     <w:p>
@@ -5534,55 +5515,145 @@
         <w:rPr>
           <w:b w:val="1"/>
           <w:bCs w:val="1"/>
-          <w:color w:val="ff0000"/>
-        </w:rPr>
-      </w:pPr>
-      <w:r>
-        <w:rPr>
-          <w:b w:val="1"/>
-          <w:bCs w:val="1"/>
-          <w:color w:val="ff0000"/>
-          <w:rtl w:val="0"/>
-        </w:rPr>
-        <w:t xml:space="preserve">En esta subsección se </w:t>
-      </w:r>
-      <w:r>
-        <w:rPr>
-          <w:b w:val="1"/>
-          <w:bCs w:val="1"/>
-          <w:color w:val="ff0000"/>
-          <w:rtl w:val="0"/>
-        </w:rPr>
-        <w:t xml:space="preserve">describe</w:t>
-      </w:r>
-      <w:r>
-        <w:rPr>
-          <w:b w:val="1"/>
-          <w:bCs w:val="1"/>
-          <w:color w:val="ff0000"/>
-          <w:rtl w:val="0"/>
-        </w:rPr>
-        <w:t xml:space="preserve"> brevemente los contenidos y la organización del resto de la ERS.</w:t>
-      </w:r>
-    </w:p>
-    <w:p>
-      <w:pPr>
-        <w:jc w:val="both"/>
-        <w:rPr>
-          <w:b w:val="1"/>
-          <w:bCs w:val="1"/>
-          <w:color w:val="366091"/>
-          <w:sz w:val="28"/>
-          <w:szCs w:val="28"/>
-        </w:rPr>
-      </w:pPr>
-      <w:r>
-        <w:br w:type="page"/>
-      </w:r>
-      <w:r>
-        <w:rPr>
-          <w:rtl w:val="0"/>
-        </w:rPr>
+        </w:rPr>
+      </w:pPr>
+      <w:r>
+        <w:rPr>
+          <w:b w:val="1"/>
+          <w:bCs w:val="1"/>
+          <w:rtl w:val="0"/>
+        </w:rPr>
+        <w:t xml:space="preserve">En esta subsección se describe brevemente los contenidos y la organización del resto de la ERS.</w:t>
+      </w:r>
+    </w:p>
+    <w:p>
+      <w:pPr>
+        <w:jc w:val="both"/>
+        <w:rPr/>
+      </w:pPr>
+      <w:r>
+        <w:rPr>
+          <w:rtl w:val="0"/>
+        </w:rPr>
+        <w:t xml:space="preserve">El documento desarrollado se estructura en tres secciones principales que presentan distintos aspectos del proyecto a realizar. </w:t>
+      </w:r>
+    </w:p>
+    <w:p>
+      <w:pPr>
+        <w:jc w:val="both"/>
+        <w:rPr/>
+      </w:pPr>
+      <w:r>
+        <w:rPr>
+          <w:rtl w:val="0"/>
+        </w:rPr>
+        <w:t xml:space="preserve">Las tres secciones mencionadas son: </w:t>
+      </w:r>
+    </w:p>
+    <w:p>
+      <w:pPr>
+        <w:ind w:left="0" w:firstLine="0"/>
+        <w:jc w:val="both"/>
+        <w:rPr>
+          <w:b w:val="1"/>
+          <w:bCs w:val="1"/>
+        </w:rPr>
+      </w:pPr>
+      <w:r>
+        <w:rPr>
+          <w:b w:val="1"/>
+          <w:bCs w:val="1"/>
+          <w:rtl w:val="0"/>
+        </w:rPr>
+        <w:t xml:space="preserve">Sección 1: Introducción</w:t>
+      </w:r>
+    </w:p>
+    <w:p>
+      <w:pPr>
+        <w:ind w:left="0" w:firstLine="0"/>
+        <w:jc w:val="both"/>
+        <w:rPr/>
+      </w:pPr>
+      <w:r>
+        <w:rPr>
+          <w:rtl w:val="0"/>
+        </w:rPr>
+        <w:t xml:space="preserve">Se describe el propósito, alcance, glosario(definiciones, acrónimos y abreviaturas)  y referencias del proyecto.</w:t>
+      </w:r>
+    </w:p>
+    <w:p>
+      <w:pPr>
+        <w:ind w:left="0" w:firstLine="0"/>
+        <w:jc w:val="both"/>
+        <w:rPr>
+          <w:b w:val="1"/>
+          <w:bCs w:val="1"/>
+        </w:rPr>
+      </w:pPr>
+      <w:r>
+        <w:rPr>
+          <w:b w:val="1"/>
+          <w:bCs w:val="1"/>
+          <w:rtl w:val="0"/>
+        </w:rPr>
+        <w:t xml:space="preserve">Sección 2: Descripción general</w:t>
+      </w:r>
+    </w:p>
+    <w:p>
+      <w:pPr>
+        <w:ind w:left="0" w:firstLine="0"/>
+        <w:jc w:val="both"/>
+        <w:rPr/>
+      </w:pPr>
+      <w:r>
+        <w:rPr>
+          <w:rtl w:val="0"/>
+        </w:rPr>
+        <w:t xml:space="preserve">Define la perspectiva y funciones del producto, las características del usuario, restricciones, suposiciones, dependencias y requisitos futuros del proyecto.</w:t>
+      </w:r>
+    </w:p>
+    <w:p>
+      <w:pPr>
+        <w:ind w:left="0" w:firstLine="0"/>
+        <w:jc w:val="both"/>
+        <w:rPr>
+          <w:b w:val="1"/>
+          <w:bCs w:val="1"/>
+        </w:rPr>
+      </w:pPr>
+      <w:r>
+        <w:rPr>
+          <w:b w:val="1"/>
+          <w:bCs w:val="1"/>
+          <w:rtl w:val="0"/>
+        </w:rPr>
+        <w:t xml:space="preserve">Sección 3: Requisitos específicos</w:t>
+      </w:r>
+    </w:p>
+    <w:p>
+      <w:pPr>
+        <w:ind w:left="0" w:firstLine="0"/>
+        <w:jc w:val="both"/>
+        <w:rPr/>
+      </w:pPr>
+      <w:r>
+        <w:rPr>
+          <w:rtl w:val="0"/>
+        </w:rPr>
+        <w:t xml:space="preserve">Define de manera detallada los requisitos de las distintas interfaces, los requisitos funcionales y requisitos no funcionales.</w:t>
+      </w:r>
+    </w:p>
+    <w:p>
+      <w:pPr>
+        <w:ind w:left="720" w:firstLine="0"/>
+        <w:jc w:val="both"/>
+        <w:rPr/>
+      </w:pPr>
+      <w:r>
+        <w:rPr>
+          <w:rtl w:val="0"/>
+        </w:rPr>
+        <w:t xml:space="preserve"> </w:t>
       </w:r>
     </w:p>
     <w:p>
@@ -5743,17 +5814,174 @@
         <w:rPr>
           <w:b w:val="1"/>
           <w:bCs w:val="1"/>
-          <w:color w:val="ff0000"/>
-        </w:rPr>
-      </w:pPr>
-      <w:r>
-        <w:rPr>
-          <w:b w:val="1"/>
-          <w:bCs w:val="1"/>
-          <w:color w:val="ff0000"/>
+        </w:rPr>
+      </w:pPr>
+      <w:r>
+        <w:rPr>
+          <w:b w:val="1"/>
+          <w:bCs w:val="1"/>
           <w:rtl w:val="0"/>
         </w:rPr>
         <w:t xml:space="preserve">En esta subsección de la ERS se mostrará un resumen, a grandes rasgos, de las funciones del futuro sistema. Las funciones deberán mostrarse de forma organizada, y pueden utilizarse gráficos, siempre y cuando dichos gráficos reflejan las relaciones entre funciones y no el diseño del sistema. (Se recomienda algún tipo de Diagrama de los componentes del sistema)</w:t>
+      </w:r>
+    </w:p>
+    <w:p>
+      <w:pPr>
+        <w:jc w:val="both"/>
+        <w:rPr/>
+      </w:pPr>
+      <w:r>
+        <w:rPr>
+          <w:rtl w:val="0"/>
+        </w:rPr>
+        <w:t xml:space="preserve">El sistema busca modernizar un sistema de ventas implementando una aplicación web del tipo E-Commerce. Las funciones clave del sistema son: </w:t>
+      </w:r>
+    </w:p>
+    <w:p>
+      <w:pPr>
+        <w:numPr>
+          <w:ilvl w:val="0"/>
+          <w:numId w:val="3"/>
+        </w:numPr>
+        <w:spacing w:after="0" w:afterAutospacing="0"/>
+        <w:ind w:left="720" w:hanging="360"/>
+        <w:jc w:val="both"/>
+        <w:rPr>
+          <w:u w:val="none"/>
+        </w:rPr>
+      </w:pPr>
+      <w:r>
+        <w:rPr>
+          <w:rtl w:val="0"/>
+        </w:rPr>
+        <w:t xml:space="preserve">Exhibir un catálogo de los productos disponibles especificando su nombre, descripción y precio, además de contar con búsqueda filtrada dentro del catálogo.</w:t>
+      </w:r>
+    </w:p>
+    <w:p>
+      <w:pPr>
+        <w:numPr>
+          <w:ilvl w:val="0"/>
+          <w:numId w:val="3"/>
+        </w:numPr>
+        <w:spacing w:after="0" w:afterAutospacing="0"/>
+        <w:ind w:left="720" w:hanging="360"/>
+        <w:jc w:val="both"/>
+        <w:rPr>
+          <w:u w:val="none"/>
+        </w:rPr>
+      </w:pPr>
+      <w:r>
+        <w:rPr>
+          <w:rtl w:val="0"/>
+        </w:rPr>
+        <w:t xml:space="preserve">Gestionar un carrito de compras con simulación de checkout dentro del cual se podrán agregar y eliminar productos, modificar cantidades y visualizar el monto total de compra, además de contar con cálculo de los descuentos definidos en las reglas de negocio.</w:t>
+      </w:r>
+    </w:p>
+    <w:p>
+      <w:pPr>
+        <w:numPr>
+          <w:ilvl w:val="0"/>
+          <w:numId w:val="3"/>
+        </w:numPr>
+        <w:spacing w:after="0" w:afterAutospacing="0"/>
+        <w:ind w:left="720" w:hanging="360"/>
+        <w:jc w:val="both"/>
+        <w:rPr>
+          <w:u w:val="none"/>
+        </w:rPr>
+      </w:pPr>
+      <w:r>
+        <w:rPr>
+          <w:rtl w:val="0"/>
+        </w:rPr>
+        <w:t xml:space="preserve">Publicar descuentos y promociones tales como: </w:t>
+      </w:r>
+    </w:p>
+    <w:p>
+      <w:pPr>
+        <w:numPr>
+          <w:ilvl w:val="0"/>
+          <w:numId w:val="12"/>
+        </w:numPr>
+        <w:spacing w:after="0" w:afterAutospacing="0"/>
+        <w:ind w:left="2160" w:hanging="360"/>
+        <w:rPr>
+          <w:u w:val="none"/>
+        </w:rPr>
+      </w:pPr>
+      <w:r>
+        <w:rPr>
+          <w:rtl w:val="0"/>
+        </w:rPr>
+        <w:t xml:space="preserve">50% de descuento en el total para usuarios mayores de 50 años.</w:t>
+      </w:r>
+    </w:p>
+    <w:p>
+      <w:pPr>
+        <w:numPr>
+          <w:ilvl w:val="0"/>
+          <w:numId w:val="12"/>
+        </w:numPr>
+        <w:spacing w:after="0" w:afterAutospacing="0"/>
+        <w:ind w:left="2160" w:hanging="360"/>
+        <w:rPr>
+          <w:u w:val="none"/>
+        </w:rPr>
+      </w:pPr>
+      <w:r>
+        <w:rPr>
+          <w:rtl w:val="0"/>
+        </w:rPr>
+        <w:t xml:space="preserve"> 10% de descuento de por vida para registros asociados al cupón </w:t>
+      </w:r>
+      <w:r>
+        <w:rPr>
+          <w:rtl w:val="0"/>
+        </w:rPr>
+        <w:t xml:space="preserve">FELICES50</w:t>
+      </w:r>
+      <w:r>
+        <w:rPr>
+          <w:rtl w:val="0"/>
+        </w:rPr>
+        <w:t xml:space="preserve">.</w:t>
+      </w:r>
+    </w:p>
+    <w:p>
+      <w:pPr>
+        <w:numPr>
+          <w:ilvl w:val="0"/>
+          <w:numId w:val="12"/>
+        </w:numPr>
+        <w:spacing w:after="0" w:afterAutospacing="0"/>
+        <w:ind w:left="2160" w:hanging="360"/>
+        <w:rPr>
+          <w:u w:val="none"/>
+        </w:rPr>
+      </w:pPr>
+      <w:r>
+        <w:rPr>
+          <w:rtl w:val="0"/>
+        </w:rPr>
+        <w:t xml:space="preserve"> Beneficio de torta gratis para estudiantes de Duoc UC en la fecha de su cumpleaños.</w:t>
+      </w:r>
+    </w:p>
+    <w:p>
+      <w:pPr>
+        <w:numPr>
+          <w:ilvl w:val="0"/>
+          <w:numId w:val="11"/>
+        </w:numPr>
+        <w:ind w:left="720" w:hanging="360"/>
+        <w:rPr>
+          <w:u w:val="none"/>
+        </w:rPr>
+      </w:pPr>
+      <w:r>
+        <w:rPr>
+          <w:rtl w:val="0"/>
+        </w:rPr>
+        <w:t xml:space="preserve">Proporcionar la opción de registro de usuario e inicio de sesión, pero permitir visitas anónimas.</w:t>
       </w:r>
     </w:p>
     <w:p>
@@ -5801,15 +6029,68 @@
       <w:pPr>
         <w:jc w:val="both"/>
         <w:rPr>
-          <w:color w:val="ff0000"/>
-        </w:rPr>
-      </w:pPr>
-      <w:r>
-        <w:rPr>
-          <w:color w:val="ff0000"/>
+          <w:b w:val="1"/>
+          <w:bCs w:val="1"/>
+        </w:rPr>
+      </w:pPr>
+      <w:r>
+        <w:rPr>
+          <w:b w:val="1"/>
+          <w:bCs w:val="1"/>
           <w:rtl w:val="0"/>
         </w:rPr>
         <w:t xml:space="preserve">Esta subsección describirá las características generales de los usuarios del producto, incluyendo nivel educacional, experiencia y experiencia técnica. Además debes definir los Tipos de Usuarios con sus perfiles.</w:t>
+      </w:r>
+    </w:p>
+    <w:p>
+      <w:pPr>
+        <w:jc w:val="both"/>
+        <w:rPr/>
+      </w:pPr>
+      <w:r>
+        <w:rPr>
+          <w:rtl w:val="0"/>
+        </w:rPr>
+        <w:t xml:space="preserve">Dentro de los usuarios del producto podemos distinguir 4 tipos de usuario:</w:t>
+      </w:r>
+    </w:p>
+    <w:p>
+      <w:pPr>
+        <w:numPr>
+          <w:ilvl w:val="0"/>
+          <w:numId w:val="1"/>
+        </w:numPr>
+        <w:spacing w:after="0" w:afterAutospacing="0"/>
+        <w:ind w:left="720" w:hanging="360"/>
+        <w:jc w:val="both"/>
+        <w:rPr>
+          <w:u w:val="none"/>
+        </w:rPr>
+      </w:pPr>
+      <w:r>
+        <w:rPr>
+          <w:rtl w:val="0"/>
+        </w:rPr>
+        <w:t xml:space="preserve">Usuario estándar/Cliente general: Debe contar con un nivel educacional básico  y una experiencia técnica baja o moderada, debe al menos saber manejar un dispositivo móvil o un computador.</w:t>
+      </w:r>
+    </w:p>
+    <w:p>
+      <w:pPr>
+        <w:numPr>
+          <w:ilvl w:val="0"/>
+          <w:numId w:val="1"/>
+        </w:numPr>
+        <w:ind w:left="720" w:hanging="360"/>
+        <w:jc w:val="both"/>
+        <w:rPr>
+          <w:u w:val="none"/>
+        </w:rPr>
+      </w:pPr>
+      <w:r>
+        <w:rPr>
+          <w:rtl w:val="0"/>
+        </w:rPr>
+        <w:t xml:space="preserve">Usuario administrador:  Debe contar con un nivel educacional superior, con conocimientos avanzados en el uso de herramientas digitales.</w:t>
       </w:r>
     </w:p>
     <w:p>
@@ -5838,12 +6119,14 @@
         <w:rPr>
           <w:b w:val="1"/>
           <w:bCs w:val="1"/>
-        </w:rPr>
-      </w:pPr>
-      <w:r>
-        <w:rPr>
-          <w:b w:val="1"/>
-          <w:bCs w:val="1"/>
+          <w:color w:val="0000ff"/>
+        </w:rPr>
+      </w:pPr>
+      <w:r>
+        <w:rPr>
+          <w:b w:val="1"/>
+          <w:bCs w:val="1"/>
+          <w:color w:val="0000ff"/>
           <w:rtl w:val="0"/>
         </w:rPr>
         <w:t xml:space="preserve">Esta subsección describirá aquellas limitaciones que se imponen sobre los desarrolladores del producto:</w:t>
@@ -6067,6 +6350,187 @@
           <w:rtl w:val="0"/>
         </w:rPr>
         <w:t xml:space="preserve">Para el presente proyecto se definen las siguientes restricciones:</w:t>
+      </w:r>
+    </w:p>
+    <w:p>
+      <w:pPr>
+        <w:numPr>
+          <w:ilvl w:val="0"/>
+          <w:numId w:val="5"/>
+        </w:numPr>
+        <w:spacing w:after="0" w:lineRule="auto"/>
+        <w:ind w:left="720" w:hanging="360"/>
+        <w:rPr/>
+      </w:pPr>
+      <w:r>
+        <w:rPr>
+          <w:rtl w:val="0"/>
+        </w:rPr>
+        <w:t xml:space="preserve"> Lenguaje(s) de programación: HTML5, CSS3 y JavaScript.</w:t>
+      </w:r>
+      <w:r>
+        <w:rPr>
+          <w:rtl w:val="0"/>
+        </w:rPr>
+      </w:r>
+    </w:p>
+    <w:p>
+      <w:pPr>
+        <w:numPr>
+          <w:ilvl w:val="0"/>
+          <w:numId w:val="5"/>
+        </w:numPr>
+        <w:spacing w:after="0" w:lineRule="auto"/>
+        <w:ind w:left="720" w:hanging="360"/>
+        <w:rPr/>
+      </w:pPr>
+      <w:r>
+        <w:rPr>
+          <w:rtl w:val="0"/>
+        </w:rPr>
+        <w:t xml:space="preserve"> La hoja de estilos debe ser externa y debe asegurar un diseño consistente y responsivo en todas las páginas.</w:t>
+      </w:r>
+      <w:r>
+        <w:rPr>
+          <w:rtl w:val="0"/>
+        </w:rPr>
+      </w:r>
+    </w:p>
+    <w:p>
+      <w:pPr>
+        <w:numPr>
+          <w:ilvl w:val="0"/>
+          <w:numId w:val="5"/>
+        </w:numPr>
+        <w:spacing w:after="0" w:lineRule="auto"/>
+        <w:ind w:left="720" w:hanging="360"/>
+        <w:rPr/>
+      </w:pPr>
+      <w:r>
+        <w:rPr>
+          <w:rtl w:val="0"/>
+        </w:rPr>
+        <w:t xml:space="preserve">Las validaciones de formularios deben implementarse en JavaScript con mensajes de error personalizados.</w:t>
+      </w:r>
+      <w:r>
+        <w:rPr>
+          <w:rtl w:val="0"/>
+        </w:rPr>
+      </w:r>
+    </w:p>
+    <w:p>
+      <w:pPr>
+        <w:numPr>
+          <w:ilvl w:val="0"/>
+          <w:numId w:val="5"/>
+        </w:numPr>
+        <w:spacing w:after="0" w:lineRule="auto"/>
+        <w:ind w:left="720" w:hanging="360"/>
+        <w:rPr/>
+      </w:pPr>
+      <w:r>
+        <w:rPr>
+          <w:rtl w:val="0"/>
+        </w:rPr>
+        <w:t xml:space="preserve">Colaboración mediante un repositorio remoto en GitHub, con comentarios claros y coherentes.</w:t>
+      </w:r>
+      <w:r>
+        <w:rPr>
+          <w:rtl w:val="0"/>
+        </w:rPr>
+      </w:r>
+    </w:p>
+    <w:p>
+      <w:pPr>
+        <w:numPr>
+          <w:ilvl w:val="0"/>
+          <w:numId w:val="5"/>
+        </w:numPr>
+        <w:ind w:left="720" w:hanging="360"/>
+        <w:rPr/>
+      </w:pPr>
+      <w:r>
+        <w:rPr>
+          <w:rtl w:val="0"/>
+        </w:rPr>
+        <w:t xml:space="preserve">Imagen corporativa: fondo crema (#FFF5E1), acentos en rosa suave (#FFC0CB) y chocolate (#8B4513), texto en marrón oscuro (#5D4037); tipografías Lato (texto) y Pacifico (encabezados).</w:t>
+      </w:r>
+      <w:r>
+        <w:rPr>
+          <w:rtl w:val="0"/>
+        </w:rPr>
+      </w:r>
+    </w:p>
+    <w:p>
+      <w:pPr>
+        <w:rPr/>
+      </w:pPr>
+      <w:r>
+        <w:rPr>
+          <w:rtl w:val="0"/>
+        </w:rPr>
+      </w:r>
+    </w:p>
+    <w:p>
+      <w:pPr>
+        <w:jc w:val="both"/>
+        <w:rPr/>
+      </w:pPr>
+      <w:r>
+        <w:rPr>
+          <w:rtl w:val="0"/>
+        </w:rPr>
+      </w:r>
+    </w:p>
+    <w:p>
+      <w:pPr>
+        <w:pStyle w:val="Heading2"/>
+        <w:jc w:val="both"/>
+        <w:rPr>
+          <w:rFonts w:ascii="Calibri" w:cs="Calibri" w:eastAsia="Calibri" w:hAnsi="Calibri"/>
+        </w:rPr>
+      </w:pPr>
+      <w:bookmarkStart w:colFirst="0" w:colLast="0" w:name="_heading=h.nop8d17gvala" w:id="14"/>
+      <w:bookmarkEnd w:id="14"/>
+      <w:r>
+        <w:rPr>
+          <w:rFonts w:ascii="Calibri" w:cs="Calibri" w:eastAsia="Calibri" w:hAnsi="Calibri"/>
+          <w:rtl w:val="0"/>
+        </w:rPr>
+        <w:t xml:space="preserve">2.5.</w:t>
+        <w:tab/>
+        <w:t xml:space="preserve">Suposiciones y Dependencias</w:t>
+      </w:r>
+    </w:p>
+    <w:p>
+      <w:pPr>
+        <w:jc w:val="both"/>
+        <w:rPr>
+          <w:b w:val="1"/>
+          <w:bCs w:val="1"/>
+          <w:color w:val="0000ff"/>
+        </w:rPr>
+      </w:pPr>
+      <w:r>
+        <w:rPr>
+          <w:b w:val="1"/>
+          <w:bCs w:val="1"/>
+          <w:color w:val="0000ff"/>
+          <w:rtl w:val="0"/>
+        </w:rPr>
+        <w:t xml:space="preserve">Esta subsección de la ERS describe aquellos factores que, si cambian, pueden afectar a los requisitos. Por ejemplo, los requisitos pueden presuponer una cierta organización de ciertas unidades de la empresa, o pueden presuponer que el sistema correrá sobre cierto sistema operativo. Si cambian dichos detalles en la organización de la empresa, o si cambian ciertos detalles técnicos, como el sistema operativo, puede ser necesario revisar y cambiar los requisitos.</w:t>
+      </w:r>
+    </w:p>
+    <w:p>
+      <w:pPr>
+        <w:jc w:val="both"/>
+        <w:rPr/>
+      </w:pPr>
+      <w:r>
+        <w:rPr>
+          <w:rtl w:val="0"/>
+        </w:rPr>
+        <w:t xml:space="preserve">La aplicación funciona bajo ciertas suposiciones técnicas específicas, entre ellas podemos destacar:</w:t>
       </w:r>
     </w:p>
     <w:p>
@@ -6077,6 +6541,7 @@
         </w:numPr>
         <w:spacing w:after="0" w:afterAutospacing="0"/>
         <w:ind w:left="720" w:hanging="360"/>
+        <w:jc w:val="both"/>
         <w:rPr>
           <w:u w:val="none"/>
         </w:rPr>
@@ -6085,7 +6550,7 @@
         <w:rPr>
           <w:rtl w:val="0"/>
         </w:rPr>
-        <w:t xml:space="preserve"> Lenguaje(s) de programación: HTML5, CSS3 y JavaScript.</w:t>
+        <w:t xml:space="preserve">El usuario utiliza un navegador web con JavaScript habilitado.</w:t>
       </w:r>
     </w:p>
     <w:p>
@@ -6096,6 +6561,7 @@
         </w:numPr>
         <w:spacing w:after="0" w:afterAutospacing="0"/>
         <w:ind w:left="720" w:hanging="360"/>
+        <w:jc w:val="both"/>
         <w:rPr>
           <w:u w:val="none"/>
         </w:rPr>
@@ -6104,45 +6570,7 @@
         <w:rPr>
           <w:rtl w:val="0"/>
         </w:rPr>
-        <w:t xml:space="preserve"> La hoja de estilos debe ser externa y debe asegurar un diseño consistente y responsivo en todas las páginas.</w:t>
-      </w:r>
-    </w:p>
-    <w:p>
-      <w:pPr>
-        <w:numPr>
-          <w:ilvl w:val="0"/>
-          <w:numId w:val="2"/>
-        </w:numPr>
-        <w:spacing w:after="0" w:afterAutospacing="0"/>
-        <w:ind w:left="720" w:hanging="360"/>
-        <w:rPr>
-          <w:u w:val="none"/>
-        </w:rPr>
-      </w:pPr>
-      <w:r>
-        <w:rPr>
-          <w:rtl w:val="0"/>
-        </w:rPr>
-        <w:t xml:space="preserve">Las validaciones de formularios deben implementarse en JavaScript con mensajes de error personalizados.</w:t>
-      </w:r>
-    </w:p>
-    <w:p>
-      <w:pPr>
-        <w:numPr>
-          <w:ilvl w:val="0"/>
-          <w:numId w:val="2"/>
-        </w:numPr>
-        <w:spacing w:after="0" w:afterAutospacing="0"/>
-        <w:ind w:left="720" w:hanging="360"/>
-        <w:rPr>
-          <w:u w:val="none"/>
-        </w:rPr>
-      </w:pPr>
-      <w:r>
-        <w:rPr>
-          <w:rtl w:val="0"/>
-        </w:rPr>
-        <w:t xml:space="preserve">Colaboración mediante un repositorio remoto en GitHub, con comentarios claros y coherentes.</w:t>
+        <w:t xml:space="preserve">El usuario utiliza un dispositivo con una resolución de ancho de pantalla de mínimo 320px.</w:t>
       </w:r>
     </w:p>
     <w:p>
@@ -6152,6 +6580,7 @@
           <w:numId w:val="2"/>
         </w:numPr>
         <w:ind w:left="720" w:hanging="360"/>
+        <w:jc w:val="both"/>
         <w:rPr>
           <w:u w:val="none"/>
         </w:rPr>
@@ -6160,67 +6589,19 @@
         <w:rPr>
           <w:rtl w:val="0"/>
         </w:rPr>
-        <w:t xml:space="preserve">Imagen corporativa: fondo crema (#FFF5E1), acentos en rosa suave (#FFC0CB) y chocolate (#8B4513), texto en marrón oscuro (#5D4037); tipografías Lato (texto) y Pacifico (encabezados).</w:t>
-      </w:r>
-    </w:p>
-    <w:p>
-      <w:pPr>
+        <w:t xml:space="preserve">El navegador no está en modo incógnito, ya que esto impide que se salve el localStorage.</w:t>
+      </w:r>
+    </w:p>
+    <w:p>
+      <w:pPr>
+        <w:ind w:left="720" w:firstLine="0"/>
+        <w:jc w:val="both"/>
         <w:rPr/>
       </w:pPr>
       <w:r>
         <w:rPr>
           <w:rtl w:val="0"/>
         </w:rPr>
-      </w:r>
-    </w:p>
-    <w:p>
-      <w:pPr>
-        <w:jc w:val="both"/>
-        <w:rPr/>
-      </w:pPr>
-      <w:r>
-        <w:rPr>
-          <w:rtl w:val="0"/>
-        </w:rPr>
-      </w:r>
-    </w:p>
-    <w:p>
-      <w:pPr>
-        <w:pStyle w:val="Heading2"/>
-        <w:jc w:val="both"/>
-        <w:rPr>
-          <w:rFonts w:ascii="Calibri" w:cs="Calibri" w:eastAsia="Calibri" w:hAnsi="Calibri"/>
-        </w:rPr>
-      </w:pPr>
-      <w:bookmarkStart w:colFirst="0" w:colLast="0" w:name="_heading=h.nop8d17gvala" w:id="14"/>
-      <w:bookmarkEnd w:id="14"/>
-      <w:r>
-        <w:rPr>
-          <w:rFonts w:ascii="Calibri" w:cs="Calibri" w:eastAsia="Calibri" w:hAnsi="Calibri"/>
-          <w:rtl w:val="0"/>
-        </w:rPr>
-        <w:t xml:space="preserve">2.5.</w:t>
-        <w:tab/>
-        <w:t xml:space="preserve">Suposiciones y Dependencias</w:t>
-      </w:r>
-    </w:p>
-    <w:p>
-      <w:pPr>
-        <w:jc w:val="both"/>
-        <w:rPr>
-          <w:b w:val="1"/>
-          <w:bCs w:val="1"/>
-          <w:color w:val="ff0000"/>
-        </w:rPr>
-      </w:pPr>
-      <w:r>
-        <w:rPr>
-          <w:b w:val="1"/>
-          <w:bCs w:val="1"/>
-          <w:color w:val="ff0000"/>
-          <w:rtl w:val="0"/>
-        </w:rPr>
-        <w:t xml:space="preserve">Esta subsección de la ERS describirá aquellos factores que, si cambian, pueden afectar a los requisitos. Por ejemplo, los requisitos pueden presuponer una cierta organización de ciertas unidades de la empresa, o pueden presuponer que el sistema correrá sobre cierto sistema operativo. Si cambian dichos detalles en la organización de la empresa, o si cambian ciertos detalles técnicos, como el sistema operativo, puede ser necesario revisar y cambiar los requisitos.</w:t>
       </w:r>
     </w:p>
     <w:p>
@@ -6275,126 +6656,142 @@
       <w:pPr>
         <w:numPr>
           <w:ilvl w:val="0"/>
-          <w:numId w:val="1"/>
+          <w:numId w:val="4"/>
         </w:numPr>
-        <w:spacing w:after="0" w:afterAutospacing="0"/>
+        <w:spacing w:after="0" w:lineRule="auto"/>
         <w:ind w:left="720" w:hanging="360"/>
-        <w:rPr>
-          <w:u w:val="none"/>
-        </w:rPr>
+        <w:rPr/>
       </w:pPr>
       <w:r>
         <w:rPr>
           <w:rtl w:val="0"/>
         </w:rPr>
         <w:t xml:space="preserve"> Integración de pasarela de pago y procesamiento real de transacciones.</w:t>
+      </w:r>
+      <w:r>
+        <w:rPr>
+          <w:rtl w:val="0"/>
+        </w:rPr>
       </w:r>
     </w:p>
     <w:p>
       <w:pPr>
         <w:numPr>
           <w:ilvl w:val="0"/>
-          <w:numId w:val="1"/>
+          <w:numId w:val="4"/>
         </w:numPr>
-        <w:spacing w:after="0" w:afterAutospacing="0"/>
+        <w:spacing w:after="0" w:lineRule="auto"/>
         <w:ind w:left="720" w:hanging="360"/>
-        <w:rPr>
-          <w:u w:val="none"/>
-        </w:rPr>
+        <w:rPr/>
       </w:pPr>
       <w:r>
         <w:rPr>
           <w:rtl w:val="0"/>
         </w:rPr>
         <w:t xml:space="preserve">Implementación de backend y base de datos para persistir productos, usuarios y pedidos.</w:t>
+      </w:r>
+      <w:r>
+        <w:rPr>
+          <w:rtl w:val="0"/>
+        </w:rPr>
       </w:r>
     </w:p>
     <w:p>
       <w:pPr>
         <w:numPr>
           <w:ilvl w:val="0"/>
-          <w:numId w:val="1"/>
+          <w:numId w:val="4"/>
         </w:numPr>
-        <w:spacing w:after="0" w:afterAutospacing="0"/>
+        <w:spacing w:after="0" w:lineRule="auto"/>
         <w:ind w:left="720" w:hanging="360"/>
-        <w:rPr>
-          <w:u w:val="none"/>
-        </w:rPr>
+        <w:rPr/>
       </w:pPr>
       <w:r>
         <w:rPr>
           <w:rtl w:val="0"/>
         </w:rPr>
         <w:t xml:space="preserve">Notificaciones de estado del pedido.</w:t>
+      </w:r>
+      <w:r>
+        <w:rPr>
+          <w:rtl w:val="0"/>
+        </w:rPr>
       </w:r>
     </w:p>
     <w:p>
       <w:pPr>
         <w:numPr>
           <w:ilvl w:val="0"/>
-          <w:numId w:val="1"/>
+          <w:numId w:val="4"/>
         </w:numPr>
-        <w:spacing w:after="0" w:afterAutospacing="0"/>
+        <w:spacing w:after="0" w:lineRule="auto"/>
         <w:ind w:left="720" w:hanging="360"/>
-        <w:rPr>
-          <w:u w:val="none"/>
-        </w:rPr>
+        <w:rPr/>
       </w:pPr>
       <w:r>
         <w:rPr>
           <w:rtl w:val="0"/>
         </w:rPr>
         <w:t xml:space="preserve">Seguimiento de envíos en tiempo real.</w:t>
+      </w:r>
+      <w:r>
+        <w:rPr>
+          <w:rtl w:val="0"/>
+        </w:rPr>
       </w:r>
     </w:p>
     <w:p>
       <w:pPr>
         <w:numPr>
           <w:ilvl w:val="0"/>
-          <w:numId w:val="1"/>
+          <w:numId w:val="4"/>
         </w:numPr>
-        <w:spacing w:after="0" w:afterAutospacing="0"/>
+        <w:spacing w:after="0" w:lineRule="auto"/>
         <w:ind w:left="720" w:hanging="360"/>
-        <w:rPr>
-          <w:u w:val="none"/>
-        </w:rPr>
+        <w:rPr/>
       </w:pPr>
       <w:r>
         <w:rPr>
           <w:rtl w:val="0"/>
         </w:rPr>
         <w:t xml:space="preserve"> Búsqueda avanzada con filtros por tipo de torta y tamaño.</w:t>
+      </w:r>
+      <w:r>
+        <w:rPr>
+          <w:rtl w:val="0"/>
+        </w:rPr>
       </w:r>
     </w:p>
     <w:p>
       <w:pPr>
         <w:numPr>
           <w:ilvl w:val="0"/>
-          <w:numId w:val="1"/>
+          <w:numId w:val="4"/>
         </w:numPr>
-        <w:spacing w:after="0" w:afterAutospacing="0"/>
+        <w:spacing w:after="0" w:lineRule="auto"/>
         <w:ind w:left="720" w:hanging="360"/>
-        <w:rPr>
-          <w:u w:val="none"/>
-        </w:rPr>
+        <w:rPr/>
       </w:pPr>
       <w:r>
         <w:rPr>
           <w:rtl w:val="0"/>
         </w:rPr>
         <w:t xml:space="preserve"> Recomendaciones personalizadas basadas en el historial de compras y preferencias del usuario.</w:t>
+      </w:r>
+      <w:r>
+        <w:rPr>
+          <w:rtl w:val="0"/>
+        </w:rPr>
       </w:r>
     </w:p>
     <w:p>
       <w:pPr>
         <w:numPr>
           <w:ilvl w:val="0"/>
-          <w:numId w:val="1"/>
+          <w:numId w:val="4"/>
         </w:numPr>
         <w:ind w:left="720" w:hanging="360"/>
-        <w:rPr>
-          <w:u w:val="none"/>
-        </w:rPr>
+        <w:rPr/>
       </w:pPr>
       <w:r>
         <w:rPr>
@@ -6402,6 +6799,11 @@
         </w:rPr>
         <w:t xml:space="preserve">Contenido educativo y de comunidad (blogs, recetas y consejos) con participación de estudiantes de gastronomía de Duoc.</w:t>
       </w:r>
+      <w:r>
+        <w:rPr>
+          <w:rtl w:val="0"/>
+        </w:rPr>
+      </w:r>
     </w:p>
     <w:p>
       <w:pPr>
@@ -6409,26 +6811,6 @@
         <w:jc w:val="both"/>
         <w:rPr/>
       </w:pPr>
-      <w:r>
-        <w:rPr>
-          <w:rtl w:val="0"/>
-        </w:rPr>
-      </w:r>
-    </w:p>
-    <w:p>
-      <w:pPr>
-        <w:jc w:val="both"/>
-        <w:rPr>
-          <w:b w:val="1"/>
-          <w:bCs w:val="1"/>
-          <w:color w:val="366091"/>
-          <w:sz w:val="28"/>
-          <w:szCs w:val="28"/>
-        </w:rPr>
-      </w:pPr>
-      <w:r>
-        <w:br w:type="page"/>
-      </w:r>
       <w:r>
         <w:rPr>
           <w:rtl w:val="0"/>
@@ -6556,7 +6938,7 @@
         <w:widowControl w:val="1"/>
         <w:numPr>
           <w:ilvl w:val="0"/>
-          <w:numId w:val="4"/>
+          <w:numId w:val="7"/>
         </w:numPr>
         <w:pBdr>
           <w:top w:space="0" w:sz="0" w:val="nil"/>
@@ -6621,6 +7003,11 @@
         </w:rPr>
         <w:t xml:space="preserve">: La ERS es correcta si y sólo si todo requisito que figura aquí (y que será implementado en el sistema) refleja alguna necesidad real. La corrección de la ERS implica que el sistema implementado será el sistema deseado.</w:t>
       </w:r>
+      <w:r>
+        <w:rPr>
+          <w:rtl w:val="0"/>
+        </w:rPr>
+      </w:r>
     </w:p>
     <w:p>
       <w:pPr>
@@ -6630,7 +7017,7 @@
         <w:widowControl w:val="1"/>
         <w:numPr>
           <w:ilvl w:val="0"/>
-          <w:numId w:val="4"/>
+          <w:numId w:val="7"/>
         </w:numPr>
         <w:pBdr>
           <w:top w:space="0" w:sz="0" w:val="nil"/>
@@ -6695,6 +7082,11 @@
         </w:rPr>
         <w:t xml:space="preserve">: Cada requisito tiene una sola interpretación. Para eliminar la ambigüedad inherente a los requisitos expresados en lenguaje natural, se deberán utilizar gráficos o notaciones formales. En el caso de utilizar términos que, habitualmente, poseen más de una interpretación, se definirán con precisión en el glosario.</w:t>
       </w:r>
+      <w:r>
+        <w:rPr>
+          <w:rtl w:val="0"/>
+        </w:rPr>
+      </w:r>
     </w:p>
     <w:p>
       <w:pPr>
@@ -6704,7 +7096,7 @@
         <w:widowControl w:val="1"/>
         <w:numPr>
           <w:ilvl w:val="0"/>
-          <w:numId w:val="4"/>
+          <w:numId w:val="7"/>
         </w:numPr>
         <w:pBdr>
           <w:top w:space="0" w:sz="0" w:val="nil"/>
@@ -6769,6 +7161,11 @@
         </w:rPr>
         <w:t xml:space="preserve">: Todos los requisitos relevantes han sido incluidos en la ERS. Conviene incluir todas las posibles respuestas del sistema a los datos de entrada, tanto válidos como no válidos.</w:t>
       </w:r>
+      <w:r>
+        <w:rPr>
+          <w:rtl w:val="0"/>
+        </w:rPr>
+      </w:r>
     </w:p>
     <w:p>
       <w:pPr>
@@ -6778,7 +7175,7 @@
         <w:widowControl w:val="1"/>
         <w:numPr>
           <w:ilvl w:val="0"/>
-          <w:numId w:val="4"/>
+          <w:numId w:val="7"/>
         </w:numPr>
         <w:pBdr>
           <w:top w:space="0" w:sz="0" w:val="nil"/>
@@ -6843,6 +7240,11 @@
         </w:rPr>
         <w:t xml:space="preserve">: Los requisitos no pueden ser contradictorios. Un conjunto de requisitos contradictorio no es implementable.</w:t>
       </w:r>
+      <w:r>
+        <w:rPr>
+          <w:rtl w:val="0"/>
+        </w:rPr>
+      </w:r>
     </w:p>
     <w:p>
       <w:pPr>
@@ -6852,7 +7254,7 @@
         <w:widowControl w:val="1"/>
         <w:numPr>
           <w:ilvl w:val="0"/>
-          <w:numId w:val="4"/>
+          <w:numId w:val="7"/>
         </w:numPr>
         <w:pBdr>
           <w:top w:space="0" w:sz="0" w:val="nil"/>
@@ -6917,6 +7319,11 @@
         </w:rPr>
         <w:t xml:space="preserve">: Normalmente, no todos los requisitos son igual de importantes. Los requisitos pueden clasificarse por importancia (esenciales, condicionales u opcionales) o por estabilidad (cambios que se espera que afecten al requisito). Esto sirve, ante todo, para no emplear excesivos recursos en implementar requisitos no esenciales.</w:t>
       </w:r>
+      <w:r>
+        <w:rPr>
+          <w:rtl w:val="0"/>
+        </w:rPr>
+      </w:r>
     </w:p>
     <w:p>
       <w:pPr>
@@ -6926,7 +7333,7 @@
         <w:widowControl w:val="1"/>
         <w:numPr>
           <w:ilvl w:val="0"/>
-          <w:numId w:val="4"/>
+          <w:numId w:val="7"/>
         </w:numPr>
         <w:pBdr>
           <w:top w:space="0" w:sz="0" w:val="nil"/>
@@ -6991,6 +7398,11 @@
         </w:rPr>
         <w:t xml:space="preserve">: La ERS es verificable si y sólo si todos sus requisitos son verificables. Un requisito es verificable (testeable) si existe un proceso finito y no costoso para demostrar que el sistema cumple con el requisito. Un requisito ambiguo no es, en general, verificable. Expresiones como a veces, bien, adecuado, etc. Introducen ambigüedad en los requisitos. Requisitos como “en caso de accidente la nube tóxica no se extenderá más allá de 25Km" no es verificable por el alto costo que conlleva.</w:t>
       </w:r>
+      <w:r>
+        <w:rPr>
+          <w:rtl w:val="0"/>
+        </w:rPr>
+      </w:r>
     </w:p>
     <w:p>
       <w:pPr>
@@ -7000,7 +7412,7 @@
         <w:widowControl w:val="1"/>
         <w:numPr>
           <w:ilvl w:val="0"/>
-          <w:numId w:val="4"/>
+          <w:numId w:val="7"/>
         </w:numPr>
         <w:pBdr>
           <w:top w:space="0" w:sz="0" w:val="nil"/>
@@ -7065,6 +7477,11 @@
         </w:rPr>
         <w:t xml:space="preserve">: La ERS es modificable si y sólo si se encuentra estructurada de forma que los cambios a los requisitos pueden realizarse de forma fácil, completa y consistente. La utilización de herramientas automáticas de gestión de requisitos facilitan enormemente esta tarea.</w:t>
       </w:r>
+      <w:r>
+        <w:rPr>
+          <w:rtl w:val="0"/>
+        </w:rPr>
+      </w:r>
     </w:p>
     <w:p>
       <w:pPr>
@@ -7074,7 +7491,7 @@
         <w:widowControl w:val="1"/>
         <w:numPr>
           <w:ilvl w:val="0"/>
-          <w:numId w:val="4"/>
+          <w:numId w:val="7"/>
         </w:numPr>
         <w:pBdr>
           <w:top w:space="0" w:sz="0" w:val="nil"/>
@@ -7139,6 +7556,11 @@
         </w:rPr>
         <w:t xml:space="preserve">: La ERS es trazable si se conoce el origen de cada requisito y se facilita la referencia de cada requisito a los componentes del diseño y de la implementación. La trazabilidad hacia atrás indica el origen (documento, persona, etc.) de cada requisito. La trazabilidad hacia delante de un requisito R indica que componentes del sistema son los que realizan el requisito R.</w:t>
       </w:r>
+      <w:r>
+        <w:rPr>
+          <w:rtl w:val="0"/>
+        </w:rPr>
+      </w:r>
     </w:p>
     <w:p>
       <w:pPr>
@@ -7367,7 +7789,7 @@
         <w:widowControl w:val="1"/>
         <w:numPr>
           <w:ilvl w:val="0"/>
-          <w:numId w:val="5"/>
+          <w:numId w:val="8"/>
         </w:numPr>
         <w:pBdr>
           <w:top w:space="0" w:sz="0" w:val="nil"/>
@@ -7412,6 +7834,11 @@
         </w:rPr>
         <w:t xml:space="preserve">Para cada producto de software debe especificarse lo siguiente:</w:t>
       </w:r>
+      <w:r>
+        <w:rPr>
+          <w:rtl w:val="0"/>
+        </w:rPr>
+      </w:r>
     </w:p>
     <w:p>
       <w:pPr>
@@ -7421,7 +7848,7 @@
         <w:widowControl w:val="1"/>
         <w:numPr>
           <w:ilvl w:val="0"/>
-          <w:numId w:val="5"/>
+          <w:numId w:val="8"/>
         </w:numPr>
         <w:pBdr>
           <w:top w:space="0" w:sz="0" w:val="nil"/>
@@ -7466,6 +7893,11 @@
         </w:rPr>
         <w:t xml:space="preserve">Descripción del producto software utilizado</w:t>
       </w:r>
+      <w:r>
+        <w:rPr>
+          <w:rtl w:val="0"/>
+        </w:rPr>
+      </w:r>
     </w:p>
     <w:p>
       <w:pPr>
@@ -7475,7 +7907,7 @@
         <w:widowControl w:val="1"/>
         <w:numPr>
           <w:ilvl w:val="0"/>
-          <w:numId w:val="5"/>
+          <w:numId w:val="8"/>
         </w:numPr>
         <w:pBdr>
           <w:top w:space="0" w:sz="0" w:val="nil"/>
@@ -7520,6 +7952,11 @@
         </w:rPr>
         <w:t xml:space="preserve">Propósito del interfaz</w:t>
       </w:r>
+      <w:r>
+        <w:rPr>
+          <w:rtl w:val="0"/>
+        </w:rPr>
+      </w:r>
     </w:p>
     <w:p>
       <w:pPr>
@@ -7529,7 +7966,7 @@
         <w:widowControl w:val="1"/>
         <w:numPr>
           <w:ilvl w:val="0"/>
-          <w:numId w:val="5"/>
+          <w:numId w:val="8"/>
         </w:numPr>
         <w:pBdr>
           <w:top w:space="0" w:sz="0" w:val="nil"/>
@@ -7601,6 +8038,11 @@
         </w:rPr>
         <w:t xml:space="preserve"> y formato</w:t>
       </w:r>
+      <w:r>
+        <w:rPr>
+          <w:rtl w:val="0"/>
+        </w:rPr>
+      </w:r>
     </w:p>
     <w:p>
       <w:pPr>
@@ -7698,6 +8140,1046 @@
           <w:rtl w:val="0"/>
         </w:rPr>
         <w:t xml:space="preserve">En ellas se incluye:</w:t>
+      </w:r>
+    </w:p>
+    <w:p>
+      <w:pPr>
+        <w:keepNext w:val="0"/>
+        <w:keepLines w:val="0"/>
+        <w:pageBreakBefore w:val="0"/>
+        <w:widowControl w:val="1"/>
+        <w:numPr>
+          <w:ilvl w:val="0"/>
+          <w:numId w:val="9"/>
+        </w:numPr>
+        <w:pBdr>
+          <w:top w:space="0" w:sz="0" w:val="nil"/>
+          <w:left w:space="0" w:sz="0" w:val="nil"/>
+          <w:bottom w:space="0" w:sz="0" w:val="nil"/>
+          <w:right w:space="0" w:sz="0" w:val="nil"/>
+          <w:between w:space="0" w:sz="0" w:val="nil"/>
+        </w:pBdr>
+        <w:shd w:fill="auto" w:val="clear"/>
+        <w:spacing w:after="0" w:before="0" w:line="276" w:lineRule="auto"/>
+        <w:ind w:left="720" w:right="0" w:hanging="360"/>
+        <w:jc w:val="both"/>
+        <w:rPr>
+          <w:b w:val="0"/>
+          <w:bCs w:val="0"/>
+          <w:i w:val="0"/>
+          <w:iCs w:val="0"/>
+          <w:smallCaps w:val="0"/>
+          <w:strike w:val="0"/>
+          <w:color w:val="ff0000"/>
+          <w:sz w:val="22"/>
+          <w:szCs w:val="22"/>
+          <w:shd w:fill="auto" w:val="clear"/>
+          <w:vertAlign w:val="baseline"/>
+        </w:rPr>
+      </w:pPr>
+      <w:r>
+        <w:rPr>
+          <w:rFonts w:ascii="Calibri" w:cs="Calibri" w:eastAsia="Calibri" w:hAnsi="Calibri"/>
+          <w:b w:val="0"/>
+          <w:bCs w:val="0"/>
+          <w:i w:val="0"/>
+          <w:iCs w:val="0"/>
+          <w:smallCaps w:val="0"/>
+          <w:strike w:val="0"/>
+          <w:color w:val="ff0000"/>
+          <w:sz w:val="22"/>
+          <w:szCs w:val="22"/>
+          <w:u w:val="none"/>
+          <w:shd w:fill="auto" w:val="clear"/>
+          <w:vertAlign w:val="baseline"/>
+          <w:rtl w:val="0"/>
+        </w:rPr>
+        <w:t xml:space="preserve">Comprobación de validez de las entradas</w:t>
+      </w:r>
+      <w:r>
+        <w:rPr>
+          <w:rtl w:val="0"/>
+        </w:rPr>
+      </w:r>
+    </w:p>
+    <w:p>
+      <w:pPr>
+        <w:keepNext w:val="0"/>
+        <w:keepLines w:val="0"/>
+        <w:pageBreakBefore w:val="0"/>
+        <w:widowControl w:val="1"/>
+        <w:numPr>
+          <w:ilvl w:val="0"/>
+          <w:numId w:val="9"/>
+        </w:numPr>
+        <w:pBdr>
+          <w:top w:space="0" w:sz="0" w:val="nil"/>
+          <w:left w:space="0" w:sz="0" w:val="nil"/>
+          <w:bottom w:space="0" w:sz="0" w:val="nil"/>
+          <w:right w:space="0" w:sz="0" w:val="nil"/>
+          <w:between w:space="0" w:sz="0" w:val="nil"/>
+        </w:pBdr>
+        <w:shd w:fill="auto" w:val="clear"/>
+        <w:spacing w:after="0" w:before="0" w:line="276" w:lineRule="auto"/>
+        <w:ind w:left="720" w:right="0" w:hanging="360"/>
+        <w:jc w:val="both"/>
+        <w:rPr>
+          <w:b w:val="0"/>
+          <w:bCs w:val="0"/>
+          <w:i w:val="0"/>
+          <w:iCs w:val="0"/>
+          <w:smallCaps w:val="0"/>
+          <w:strike w:val="0"/>
+          <w:color w:val="ff0000"/>
+          <w:sz w:val="22"/>
+          <w:szCs w:val="22"/>
+          <w:shd w:fill="auto" w:val="clear"/>
+          <w:vertAlign w:val="baseline"/>
+        </w:rPr>
+      </w:pPr>
+      <w:r>
+        <w:rPr>
+          <w:rFonts w:ascii="Calibri" w:cs="Calibri" w:eastAsia="Calibri" w:hAnsi="Calibri"/>
+          <w:b w:val="0"/>
+          <w:bCs w:val="0"/>
+          <w:i w:val="0"/>
+          <w:iCs w:val="0"/>
+          <w:smallCaps w:val="0"/>
+          <w:strike w:val="0"/>
+          <w:color w:val="ff0000"/>
+          <w:sz w:val="22"/>
+          <w:szCs w:val="22"/>
+          <w:u w:val="none"/>
+          <w:shd w:fill="auto" w:val="clear"/>
+          <w:vertAlign w:val="baseline"/>
+          <w:rtl w:val="0"/>
+        </w:rPr>
+        <w:t xml:space="preserve">Secuencia exacta de operaciones</w:t>
+      </w:r>
+      <w:r>
+        <w:rPr>
+          <w:rtl w:val="0"/>
+        </w:rPr>
+      </w:r>
+    </w:p>
+    <w:p>
+      <w:pPr>
+        <w:keepNext w:val="0"/>
+        <w:keepLines w:val="0"/>
+        <w:pageBreakBefore w:val="0"/>
+        <w:widowControl w:val="1"/>
+        <w:numPr>
+          <w:ilvl w:val="0"/>
+          <w:numId w:val="9"/>
+        </w:numPr>
+        <w:pBdr>
+          <w:top w:space="0" w:sz="0" w:val="nil"/>
+          <w:left w:space="0" w:sz="0" w:val="nil"/>
+          <w:bottom w:space="0" w:sz="0" w:val="nil"/>
+          <w:right w:space="0" w:sz="0" w:val="nil"/>
+          <w:between w:space="0" w:sz="0" w:val="nil"/>
+        </w:pBdr>
+        <w:shd w:fill="auto" w:val="clear"/>
+        <w:spacing w:after="0" w:before="0" w:line="276" w:lineRule="auto"/>
+        <w:ind w:left="720" w:right="0" w:hanging="360"/>
+        <w:jc w:val="both"/>
+        <w:rPr>
+          <w:b w:val="0"/>
+          <w:bCs w:val="0"/>
+          <w:i w:val="0"/>
+          <w:iCs w:val="0"/>
+          <w:smallCaps w:val="0"/>
+          <w:strike w:val="0"/>
+          <w:color w:val="ff0000"/>
+          <w:sz w:val="22"/>
+          <w:szCs w:val="22"/>
+          <w:shd w:fill="auto" w:val="clear"/>
+          <w:vertAlign w:val="baseline"/>
+        </w:rPr>
+      </w:pPr>
+      <w:r>
+        <w:rPr>
+          <w:rFonts w:ascii="Calibri" w:cs="Calibri" w:eastAsia="Calibri" w:hAnsi="Calibri"/>
+          <w:b w:val="0"/>
+          <w:bCs w:val="0"/>
+          <w:i w:val="0"/>
+          <w:iCs w:val="0"/>
+          <w:smallCaps w:val="0"/>
+          <w:strike w:val="0"/>
+          <w:color w:val="ff0000"/>
+          <w:sz w:val="22"/>
+          <w:szCs w:val="22"/>
+          <w:u w:val="none"/>
+          <w:shd w:fill="auto" w:val="clear"/>
+          <w:vertAlign w:val="baseline"/>
+          <w:rtl w:val="0"/>
+        </w:rPr>
+        <w:t xml:space="preserve">Respuesta a situaciones anormales (desbordamientos, comunicaciones, recuperación de errores)</w:t>
+      </w:r>
+      <w:r>
+        <w:rPr>
+          <w:rtl w:val="0"/>
+        </w:rPr>
+      </w:r>
+    </w:p>
+    <w:p>
+      <w:pPr>
+        <w:keepNext w:val="0"/>
+        <w:keepLines w:val="0"/>
+        <w:pageBreakBefore w:val="0"/>
+        <w:widowControl w:val="1"/>
+        <w:numPr>
+          <w:ilvl w:val="0"/>
+          <w:numId w:val="9"/>
+        </w:numPr>
+        <w:pBdr>
+          <w:top w:space="0" w:sz="0" w:val="nil"/>
+          <w:left w:space="0" w:sz="0" w:val="nil"/>
+          <w:bottom w:space="0" w:sz="0" w:val="nil"/>
+          <w:right w:space="0" w:sz="0" w:val="nil"/>
+          <w:between w:space="0" w:sz="0" w:val="nil"/>
+        </w:pBdr>
+        <w:shd w:fill="auto" w:val="clear"/>
+        <w:spacing w:after="0" w:before="0" w:line="276" w:lineRule="auto"/>
+        <w:ind w:left="720" w:right="0" w:hanging="360"/>
+        <w:jc w:val="both"/>
+        <w:rPr>
+          <w:b w:val="0"/>
+          <w:bCs w:val="0"/>
+          <w:i w:val="0"/>
+          <w:iCs w:val="0"/>
+          <w:smallCaps w:val="0"/>
+          <w:strike w:val="0"/>
+          <w:color w:val="ff0000"/>
+          <w:sz w:val="22"/>
+          <w:szCs w:val="22"/>
+          <w:shd w:fill="auto" w:val="clear"/>
+          <w:vertAlign w:val="baseline"/>
+        </w:rPr>
+      </w:pPr>
+      <w:r>
+        <w:rPr>
+          <w:rFonts w:ascii="Calibri" w:cs="Calibri" w:eastAsia="Calibri" w:hAnsi="Calibri"/>
+          <w:b w:val="0"/>
+          <w:bCs w:val="0"/>
+          <w:i w:val="0"/>
+          <w:iCs w:val="0"/>
+          <w:smallCaps w:val="0"/>
+          <w:strike w:val="0"/>
+          <w:color w:val="ff0000"/>
+          <w:sz w:val="22"/>
+          <w:szCs w:val="22"/>
+          <w:u w:val="none"/>
+          <w:shd w:fill="auto" w:val="clear"/>
+          <w:vertAlign w:val="baseline"/>
+          <w:rtl w:val="0"/>
+        </w:rPr>
+        <w:t xml:space="preserve">Parámetros</w:t>
+      </w:r>
+      <w:r>
+        <w:rPr>
+          <w:rtl w:val="0"/>
+        </w:rPr>
+      </w:r>
+    </w:p>
+    <w:p>
+      <w:pPr>
+        <w:keepNext w:val="0"/>
+        <w:keepLines w:val="0"/>
+        <w:pageBreakBefore w:val="0"/>
+        <w:widowControl w:val="1"/>
+        <w:numPr>
+          <w:ilvl w:val="0"/>
+          <w:numId w:val="9"/>
+        </w:numPr>
+        <w:pBdr>
+          <w:top w:space="0" w:sz="0" w:val="nil"/>
+          <w:left w:space="0" w:sz="0" w:val="nil"/>
+          <w:bottom w:space="0" w:sz="0" w:val="nil"/>
+          <w:right w:space="0" w:sz="0" w:val="nil"/>
+          <w:between w:space="0" w:sz="0" w:val="nil"/>
+        </w:pBdr>
+        <w:shd w:fill="auto" w:val="clear"/>
+        <w:spacing w:after="0" w:before="0" w:line="276" w:lineRule="auto"/>
+        <w:ind w:left="720" w:right="0" w:hanging="360"/>
+        <w:jc w:val="both"/>
+        <w:rPr>
+          <w:b w:val="0"/>
+          <w:bCs w:val="0"/>
+          <w:i w:val="0"/>
+          <w:iCs w:val="0"/>
+          <w:smallCaps w:val="0"/>
+          <w:strike w:val="0"/>
+          <w:color w:val="ff0000"/>
+          <w:sz w:val="22"/>
+          <w:szCs w:val="22"/>
+          <w:shd w:fill="auto" w:val="clear"/>
+          <w:vertAlign w:val="baseline"/>
+        </w:rPr>
+      </w:pPr>
+      <w:r>
+        <w:rPr>
+          <w:rFonts w:ascii="Calibri" w:cs="Calibri" w:eastAsia="Calibri" w:hAnsi="Calibri"/>
+          <w:b w:val="0"/>
+          <w:bCs w:val="0"/>
+          <w:i w:val="0"/>
+          <w:iCs w:val="0"/>
+          <w:smallCaps w:val="0"/>
+          <w:strike w:val="0"/>
+          <w:color w:val="ff0000"/>
+          <w:sz w:val="22"/>
+          <w:szCs w:val="22"/>
+          <w:u w:val="none"/>
+          <w:shd w:fill="auto" w:val="clear"/>
+          <w:vertAlign w:val="baseline"/>
+          <w:rtl w:val="0"/>
+        </w:rPr>
+        <w:t xml:space="preserve">Generación de salidas</w:t>
+      </w:r>
+      <w:r>
+        <w:rPr>
+          <w:rtl w:val="0"/>
+        </w:rPr>
+      </w:r>
+    </w:p>
+    <w:p>
+      <w:pPr>
+        <w:keepNext w:val="0"/>
+        <w:keepLines w:val="0"/>
+        <w:pageBreakBefore w:val="0"/>
+        <w:widowControl w:val="1"/>
+        <w:numPr>
+          <w:ilvl w:val="0"/>
+          <w:numId w:val="9"/>
+        </w:numPr>
+        <w:pBdr>
+          <w:top w:space="0" w:sz="0" w:val="nil"/>
+          <w:left w:space="0" w:sz="0" w:val="nil"/>
+          <w:bottom w:space="0" w:sz="0" w:val="nil"/>
+          <w:right w:space="0" w:sz="0" w:val="nil"/>
+          <w:between w:space="0" w:sz="0" w:val="nil"/>
+        </w:pBdr>
+        <w:shd w:fill="auto" w:val="clear"/>
+        <w:spacing w:after="0" w:before="0" w:line="276" w:lineRule="auto"/>
+        <w:ind w:left="720" w:right="0" w:hanging="360"/>
+        <w:jc w:val="both"/>
+        <w:rPr>
+          <w:b w:val="0"/>
+          <w:bCs w:val="0"/>
+          <w:i w:val="0"/>
+          <w:iCs w:val="0"/>
+          <w:smallCaps w:val="0"/>
+          <w:strike w:val="0"/>
+          <w:color w:val="ff0000"/>
+          <w:sz w:val="22"/>
+          <w:szCs w:val="22"/>
+          <w:shd w:fill="auto" w:val="clear"/>
+          <w:vertAlign w:val="baseline"/>
+        </w:rPr>
+      </w:pPr>
+      <w:r>
+        <w:rPr>
+          <w:rFonts w:ascii="Calibri" w:cs="Calibri" w:eastAsia="Calibri" w:hAnsi="Calibri"/>
+          <w:b w:val="0"/>
+          <w:bCs w:val="0"/>
+          <w:i w:val="0"/>
+          <w:iCs w:val="0"/>
+          <w:smallCaps w:val="0"/>
+          <w:strike w:val="0"/>
+          <w:color w:val="ff0000"/>
+          <w:sz w:val="22"/>
+          <w:szCs w:val="22"/>
+          <w:u w:val="none"/>
+          <w:shd w:fill="auto" w:val="clear"/>
+          <w:vertAlign w:val="baseline"/>
+          <w:rtl w:val="0"/>
+        </w:rPr>
+        <w:t xml:space="preserve">Relaciones entre entradas y salidas (secuencias de entradas y salidas, fórmulas para la conversión de información)</w:t>
+      </w:r>
+      <w:r>
+        <w:rPr>
+          <w:rtl w:val="0"/>
+        </w:rPr>
+      </w:r>
+    </w:p>
+    <w:p>
+      <w:pPr>
+        <w:keepNext w:val="0"/>
+        <w:keepLines w:val="0"/>
+        <w:pageBreakBefore w:val="0"/>
+        <w:widowControl w:val="1"/>
+        <w:numPr>
+          <w:ilvl w:val="0"/>
+          <w:numId w:val="9"/>
+        </w:numPr>
+        <w:pBdr>
+          <w:top w:space="0" w:sz="0" w:val="nil"/>
+          <w:left w:space="0" w:sz="0" w:val="nil"/>
+          <w:bottom w:space="0" w:sz="0" w:val="nil"/>
+          <w:right w:space="0" w:sz="0" w:val="nil"/>
+          <w:between w:space="0" w:sz="0" w:val="nil"/>
+        </w:pBdr>
+        <w:shd w:fill="auto" w:val="clear"/>
+        <w:spacing w:after="200" w:before="0" w:line="276" w:lineRule="auto"/>
+        <w:ind w:left="720" w:right="0" w:hanging="360"/>
+        <w:jc w:val="both"/>
+        <w:rPr>
+          <w:b w:val="0"/>
+          <w:bCs w:val="0"/>
+          <w:i w:val="0"/>
+          <w:iCs w:val="0"/>
+          <w:smallCaps w:val="0"/>
+          <w:strike w:val="0"/>
+          <w:color w:val="ff0000"/>
+          <w:sz w:val="22"/>
+          <w:szCs w:val="22"/>
+          <w:shd w:fill="auto" w:val="clear"/>
+          <w:vertAlign w:val="baseline"/>
+        </w:rPr>
+      </w:pPr>
+      <w:r>
+        <w:rPr>
+          <w:rFonts w:ascii="Calibri" w:cs="Calibri" w:eastAsia="Calibri" w:hAnsi="Calibri"/>
+          <w:b w:val="0"/>
+          <w:bCs w:val="0"/>
+          <w:i w:val="0"/>
+          <w:iCs w:val="0"/>
+          <w:smallCaps w:val="0"/>
+          <w:strike w:val="0"/>
+          <w:color w:val="ff0000"/>
+          <w:sz w:val="22"/>
+          <w:szCs w:val="22"/>
+          <w:u w:val="none"/>
+          <w:shd w:fill="auto" w:val="clear"/>
+          <w:vertAlign w:val="baseline"/>
+          <w:rtl w:val="0"/>
+        </w:rPr>
+        <w:t xml:space="preserve">Especificación de los requisitos lógicos para la información que será  almacenada en base de datos (tipo de información, requerido)</w:t>
+      </w:r>
+      <w:r>
+        <w:rPr>
+          <w:rtl w:val="0"/>
+        </w:rPr>
+      </w:r>
+    </w:p>
+    <w:p>
+      <w:pPr>
+        <w:jc w:val="both"/>
+        <w:rPr>
+          <w:color w:val="ff0000"/>
+        </w:rPr>
+      </w:pPr>
+      <w:r>
+        <w:rPr>
+          <w:color w:val="ff0000"/>
+          <w:rtl w:val="0"/>
+        </w:rPr>
+        <w:t xml:space="preserve">Los requisitos funcionales pueden ser divididos en sub-secciones.</w:t>
+      </w:r>
+    </w:p>
+    <w:p>
+      <w:pPr>
+        <w:rPr>
+          <w:color w:val="ff0000"/>
+        </w:rPr>
+      </w:pPr>
+      <w:r>
+        <w:rPr>
+          <w:rtl w:val="0"/>
+        </w:rPr>
+      </w:r>
+    </w:p>
+    <w:p>
+      <w:pPr>
+        <w:pStyle w:val="Heading2"/>
+        <w:jc w:val="both"/>
+        <w:rPr>
+          <w:rFonts w:ascii="Calibri" w:cs="Calibri" w:eastAsia="Calibri" w:hAnsi="Calibri"/>
+        </w:rPr>
+      </w:pPr>
+      <w:bookmarkStart w:colFirst="0" w:colLast="0" w:name="_heading=h.zcpzwpioejr5" w:id="23"/>
+      <w:bookmarkEnd w:id="23"/>
+      <w:r>
+        <w:rPr>
+          <w:rFonts w:ascii="Calibri" w:cs="Calibri" w:eastAsia="Calibri" w:hAnsi="Calibri"/>
+          <w:rtl w:val="0"/>
+        </w:rPr>
+        <w:t xml:space="preserve">3.3</w:t>
+        <w:tab/>
+        <w:t xml:space="preserve">Requisitos no funcionales</w:t>
+      </w:r>
+    </w:p>
+    <w:p>
+      <w:pPr>
+        <w:pStyle w:val="Heading3"/>
+        <w:jc w:val="both"/>
+        <w:rPr>
+          <w:rFonts w:ascii="Calibri" w:cs="Calibri" w:eastAsia="Calibri" w:hAnsi="Calibri"/>
+        </w:rPr>
+      </w:pPr>
+      <w:bookmarkStart w:colFirst="0" w:colLast="0" w:name="_heading=h.dn4gxhgvzmg4" w:id="24"/>
+      <w:bookmarkEnd w:id="24"/>
+      <w:r>
+        <w:rPr>
+          <w:rFonts w:ascii="Calibri" w:cs="Calibri" w:eastAsia="Calibri" w:hAnsi="Calibri"/>
+          <w:rtl w:val="0"/>
+        </w:rPr>
+        <w:t xml:space="preserve">3.3.1</w:t>
+        <w:tab/>
+        <w:t xml:space="preserve">Requisitos de rendimiento</w:t>
+      </w:r>
+    </w:p>
+    <w:p>
+      <w:pPr>
+        <w:jc w:val="both"/>
+        <w:rPr>
+          <w:b w:val="1"/>
+          <w:bCs w:val="1"/>
+          <w:color w:val="ff0000"/>
+        </w:rPr>
+      </w:pPr>
+      <w:r>
+        <w:rPr>
+          <w:b w:val="1"/>
+          <w:bCs w:val="1"/>
+          <w:color w:val="ff0000"/>
+          <w:rtl w:val="0"/>
+        </w:rPr>
+        <w:t xml:space="preserve">Especificación de los requisitos relacionados con la carga que se espera tenga que soportar el sistema. Por ejemplo, el número de terminales, el número esperado de usuarios simultáneamente conectados, número de transacciones por segundo que deberá soportar el sistema, etc.</w:t>
+      </w:r>
+    </w:p>
+    <w:p>
+      <w:pPr>
+        <w:jc w:val="both"/>
+        <w:rPr>
+          <w:b w:val="1"/>
+          <w:bCs w:val="1"/>
+          <w:color w:val="ff0000"/>
+        </w:rPr>
+      </w:pPr>
+      <w:r>
+        <w:rPr>
+          <w:b w:val="1"/>
+          <w:bCs w:val="1"/>
+          <w:color w:val="ff0000"/>
+          <w:rtl w:val="0"/>
+        </w:rPr>
+        <w:t xml:space="preserve">Todos estos requisitos deben ser mesurables. Por ejemplo, indicando “el 95% de las transacciones deben realizarse en menos de 1 segundo”, en lugar de “los operadores no deben esperar a que se complete la transacción”.</w:t>
+      </w:r>
+    </w:p>
+    <w:p>
+      <w:pPr>
+        <w:pStyle w:val="Heading3"/>
+        <w:jc w:val="both"/>
+        <w:rPr>
+          <w:rFonts w:ascii="Calibri" w:cs="Calibri" w:eastAsia="Calibri" w:hAnsi="Calibri"/>
+        </w:rPr>
+      </w:pPr>
+      <w:bookmarkStart w:colFirst="0" w:colLast="0" w:name="_heading=h.oyrp4hdi48n6" w:id="25"/>
+      <w:bookmarkEnd w:id="25"/>
+      <w:r>
+        <w:rPr>
+          <w:rFonts w:ascii="Calibri" w:cs="Calibri" w:eastAsia="Calibri" w:hAnsi="Calibri"/>
+          <w:rtl w:val="0"/>
+        </w:rPr>
+        <w:t xml:space="preserve">3.3.2</w:t>
+        <w:tab/>
+        <w:t xml:space="preserve">Seguridad</w:t>
+      </w:r>
+    </w:p>
+    <w:p>
+      <w:pPr>
+        <w:jc w:val="both"/>
+        <w:rPr>
+          <w:color w:val="ff0000"/>
+        </w:rPr>
+      </w:pPr>
+      <w:r>
+        <w:rPr>
+          <w:color w:val="ff0000"/>
+          <w:rtl w:val="0"/>
+        </w:rPr>
+        <w:t xml:space="preserve">Especificación de elementos que protegerán al software de accesos, usos y sabotajes maliciosos, así como de modificaciones o destrucciones maliciosas o accidentales. Los requisitos pueden especificar:</w:t>
+      </w:r>
+    </w:p>
+    <w:p>
+      <w:pPr>
+        <w:keepNext w:val="0"/>
+        <w:keepLines w:val="0"/>
+        <w:pageBreakBefore w:val="0"/>
+        <w:widowControl w:val="1"/>
+        <w:numPr>
+          <w:ilvl w:val="0"/>
+          <w:numId w:val="10"/>
+        </w:numPr>
+        <w:pBdr>
+          <w:top w:space="0" w:sz="0" w:val="nil"/>
+          <w:left w:space="0" w:sz="0" w:val="nil"/>
+          <w:bottom w:space="0" w:sz="0" w:val="nil"/>
+          <w:right w:space="0" w:sz="0" w:val="nil"/>
+          <w:between w:space="0" w:sz="0" w:val="nil"/>
+        </w:pBdr>
+        <w:shd w:fill="auto" w:val="clear"/>
+        <w:spacing w:after="0" w:before="0" w:line="276" w:lineRule="auto"/>
+        <w:ind w:left="720" w:right="0" w:hanging="360"/>
+        <w:jc w:val="both"/>
+        <w:rPr>
+          <w:b w:val="0"/>
+          <w:bCs w:val="0"/>
+          <w:i w:val="0"/>
+          <w:iCs w:val="0"/>
+          <w:smallCaps w:val="0"/>
+          <w:strike w:val="0"/>
+          <w:color w:val="ff0000"/>
+          <w:sz w:val="22"/>
+          <w:szCs w:val="22"/>
+          <w:shd w:fill="auto" w:val="clear"/>
+          <w:vertAlign w:val="baseline"/>
+        </w:rPr>
+      </w:pPr>
+      <w:r>
+        <w:rPr>
+          <w:rFonts w:ascii="Calibri" w:cs="Calibri" w:eastAsia="Calibri" w:hAnsi="Calibri"/>
+          <w:b w:val="0"/>
+          <w:bCs w:val="0"/>
+          <w:i w:val="0"/>
+          <w:iCs w:val="0"/>
+          <w:smallCaps w:val="0"/>
+          <w:strike w:val="0"/>
+          <w:color w:val="ff0000"/>
+          <w:sz w:val="22"/>
+          <w:szCs w:val="22"/>
+          <w:u w:val="none"/>
+          <w:shd w:fill="auto" w:val="clear"/>
+          <w:vertAlign w:val="baseline"/>
+          <w:rtl w:val="0"/>
+        </w:rPr>
+        <w:t xml:space="preserve">Empleo de técnicas criptográficas.</w:t>
+      </w:r>
+      <w:r>
+        <w:rPr>
+          <w:rtl w:val="0"/>
+        </w:rPr>
+      </w:r>
+    </w:p>
+    <w:p>
+      <w:pPr>
+        <w:keepNext w:val="0"/>
+        <w:keepLines w:val="0"/>
+        <w:pageBreakBefore w:val="0"/>
+        <w:widowControl w:val="1"/>
+        <w:numPr>
+          <w:ilvl w:val="0"/>
+          <w:numId w:val="10"/>
+        </w:numPr>
+        <w:pBdr>
+          <w:top w:space="0" w:sz="0" w:val="nil"/>
+          <w:left w:space="0" w:sz="0" w:val="nil"/>
+          <w:bottom w:space="0" w:sz="0" w:val="nil"/>
+          <w:right w:space="0" w:sz="0" w:val="nil"/>
+          <w:between w:space="0" w:sz="0" w:val="nil"/>
+        </w:pBdr>
+        <w:shd w:fill="auto" w:val="clear"/>
+        <w:spacing w:after="0" w:before="0" w:line="276" w:lineRule="auto"/>
+        <w:ind w:left="720" w:right="0" w:hanging="360"/>
+        <w:jc w:val="both"/>
+        <w:rPr>
+          <w:b w:val="0"/>
+          <w:bCs w:val="0"/>
+          <w:i w:val="0"/>
+          <w:iCs w:val="0"/>
+          <w:smallCaps w:val="0"/>
+          <w:strike w:val="0"/>
+          <w:color w:val="ff0000"/>
+          <w:sz w:val="22"/>
+          <w:szCs w:val="22"/>
+          <w:shd w:fill="auto" w:val="clear"/>
+          <w:vertAlign w:val="baseline"/>
+        </w:rPr>
+      </w:pPr>
+      <w:r>
+        <w:rPr>
+          <w:rFonts w:ascii="Calibri" w:cs="Calibri" w:eastAsia="Calibri" w:hAnsi="Calibri"/>
+          <w:b w:val="0"/>
+          <w:bCs w:val="0"/>
+          <w:i w:val="0"/>
+          <w:iCs w:val="0"/>
+          <w:smallCaps w:val="0"/>
+          <w:strike w:val="0"/>
+          <w:color w:val="ff0000"/>
+          <w:sz w:val="22"/>
+          <w:szCs w:val="22"/>
+          <w:u w:val="none"/>
+          <w:shd w:fill="auto" w:val="clear"/>
+          <w:vertAlign w:val="baseline"/>
+          <w:rtl w:val="0"/>
+        </w:rPr>
+        <w:t xml:space="preserve">Registro de ficheros con “logs” de actividad.</w:t>
+      </w:r>
+      <w:r>
+        <w:rPr>
+          <w:rtl w:val="0"/>
+        </w:rPr>
+      </w:r>
+    </w:p>
+    <w:p>
+      <w:pPr>
+        <w:keepNext w:val="0"/>
+        <w:keepLines w:val="0"/>
+        <w:pageBreakBefore w:val="0"/>
+        <w:widowControl w:val="1"/>
+        <w:numPr>
+          <w:ilvl w:val="0"/>
+          <w:numId w:val="10"/>
+        </w:numPr>
+        <w:pBdr>
+          <w:top w:space="0" w:sz="0" w:val="nil"/>
+          <w:left w:space="0" w:sz="0" w:val="nil"/>
+          <w:bottom w:space="0" w:sz="0" w:val="nil"/>
+          <w:right w:space="0" w:sz="0" w:val="nil"/>
+          <w:between w:space="0" w:sz="0" w:val="nil"/>
+        </w:pBdr>
+        <w:shd w:fill="auto" w:val="clear"/>
+        <w:spacing w:after="0" w:before="0" w:line="276" w:lineRule="auto"/>
+        <w:ind w:left="720" w:right="0" w:hanging="360"/>
+        <w:jc w:val="both"/>
+        <w:rPr>
+          <w:b w:val="0"/>
+          <w:bCs w:val="0"/>
+          <w:i w:val="0"/>
+          <w:iCs w:val="0"/>
+          <w:smallCaps w:val="0"/>
+          <w:strike w:val="0"/>
+          <w:color w:val="ff0000"/>
+          <w:sz w:val="22"/>
+          <w:szCs w:val="22"/>
+          <w:shd w:fill="auto" w:val="clear"/>
+          <w:vertAlign w:val="baseline"/>
+        </w:rPr>
+      </w:pPr>
+      <w:r>
+        <w:rPr>
+          <w:rFonts w:ascii="Calibri" w:cs="Calibri" w:eastAsia="Calibri" w:hAnsi="Calibri"/>
+          <w:b w:val="0"/>
+          <w:bCs w:val="0"/>
+          <w:i w:val="0"/>
+          <w:iCs w:val="0"/>
+          <w:smallCaps w:val="0"/>
+          <w:strike w:val="0"/>
+          <w:color w:val="ff0000"/>
+          <w:sz w:val="22"/>
+          <w:szCs w:val="22"/>
+          <w:u w:val="none"/>
+          <w:shd w:fill="auto" w:val="clear"/>
+          <w:vertAlign w:val="baseline"/>
+          <w:rtl w:val="0"/>
+        </w:rPr>
+        <w:t xml:space="preserve">Asignación de determinadas funcionalidades a determinados módulos.</w:t>
+      </w:r>
+      <w:r>
+        <w:rPr>
+          <w:rtl w:val="0"/>
+        </w:rPr>
+      </w:r>
+    </w:p>
+    <w:p>
+      <w:pPr>
+        <w:keepNext w:val="0"/>
+        <w:keepLines w:val="0"/>
+        <w:pageBreakBefore w:val="0"/>
+        <w:widowControl w:val="1"/>
+        <w:numPr>
+          <w:ilvl w:val="0"/>
+          <w:numId w:val="10"/>
+        </w:numPr>
+        <w:pBdr>
+          <w:top w:space="0" w:sz="0" w:val="nil"/>
+          <w:left w:space="0" w:sz="0" w:val="nil"/>
+          <w:bottom w:space="0" w:sz="0" w:val="nil"/>
+          <w:right w:space="0" w:sz="0" w:val="nil"/>
+          <w:between w:space="0" w:sz="0" w:val="nil"/>
+        </w:pBdr>
+        <w:shd w:fill="auto" w:val="clear"/>
+        <w:spacing w:after="0" w:before="0" w:line="276" w:lineRule="auto"/>
+        <w:ind w:left="720" w:right="0" w:hanging="360"/>
+        <w:jc w:val="both"/>
+        <w:rPr>
+          <w:b w:val="0"/>
+          <w:bCs w:val="0"/>
+          <w:i w:val="0"/>
+          <w:iCs w:val="0"/>
+          <w:smallCaps w:val="0"/>
+          <w:strike w:val="0"/>
+          <w:color w:val="ff0000"/>
+          <w:sz w:val="22"/>
+          <w:szCs w:val="22"/>
+          <w:shd w:fill="auto" w:val="clear"/>
+          <w:vertAlign w:val="baseline"/>
+        </w:rPr>
+      </w:pPr>
+      <w:r>
+        <w:rPr>
+          <w:rFonts w:ascii="Calibri" w:cs="Calibri" w:eastAsia="Calibri" w:hAnsi="Calibri"/>
+          <w:b w:val="0"/>
+          <w:bCs w:val="0"/>
+          <w:i w:val="0"/>
+          <w:iCs w:val="0"/>
+          <w:smallCaps w:val="0"/>
+          <w:strike w:val="0"/>
+          <w:color w:val="ff0000"/>
+          <w:sz w:val="22"/>
+          <w:szCs w:val="22"/>
+          <w:u w:val="none"/>
+          <w:shd w:fill="auto" w:val="clear"/>
+          <w:vertAlign w:val="baseline"/>
+          <w:rtl w:val="0"/>
+        </w:rPr>
+        <w:t xml:space="preserve">Restricciones de comunicación entre determinados módulos.</w:t>
+      </w:r>
+      <w:r>
+        <w:rPr>
+          <w:rtl w:val="0"/>
+        </w:rPr>
+      </w:r>
+    </w:p>
+    <w:p>
+      <w:pPr>
+        <w:keepNext w:val="0"/>
+        <w:keepLines w:val="0"/>
+        <w:pageBreakBefore w:val="0"/>
+        <w:widowControl w:val="1"/>
+        <w:numPr>
+          <w:ilvl w:val="0"/>
+          <w:numId w:val="10"/>
+        </w:numPr>
+        <w:pBdr>
+          <w:top w:space="0" w:sz="0" w:val="nil"/>
+          <w:left w:space="0" w:sz="0" w:val="nil"/>
+          <w:bottom w:space="0" w:sz="0" w:val="nil"/>
+          <w:right w:space="0" w:sz="0" w:val="nil"/>
+          <w:between w:space="0" w:sz="0" w:val="nil"/>
+        </w:pBdr>
+        <w:shd w:fill="auto" w:val="clear"/>
+        <w:spacing w:after="200" w:before="0" w:line="276" w:lineRule="auto"/>
+        <w:ind w:left="720" w:right="0" w:hanging="360"/>
+        <w:jc w:val="both"/>
+        <w:rPr>
+          <w:b w:val="0"/>
+          <w:bCs w:val="0"/>
+          <w:i w:val="0"/>
+          <w:iCs w:val="0"/>
+          <w:smallCaps w:val="0"/>
+          <w:strike w:val="0"/>
+          <w:color w:val="ff0000"/>
+          <w:sz w:val="22"/>
+          <w:szCs w:val="22"/>
+          <w:shd w:fill="auto" w:val="clear"/>
+          <w:vertAlign w:val="baseline"/>
+        </w:rPr>
+      </w:pPr>
+      <w:r>
+        <w:rPr>
+          <w:rFonts w:ascii="Calibri" w:cs="Calibri" w:eastAsia="Calibri" w:hAnsi="Calibri"/>
+          <w:b w:val="0"/>
+          <w:bCs w:val="0"/>
+          <w:i w:val="0"/>
+          <w:iCs w:val="0"/>
+          <w:smallCaps w:val="0"/>
+          <w:strike w:val="0"/>
+          <w:color w:val="ff0000"/>
+          <w:sz w:val="22"/>
+          <w:szCs w:val="22"/>
+          <w:u w:val="none"/>
+          <w:shd w:fill="auto" w:val="clear"/>
+          <w:vertAlign w:val="baseline"/>
+          <w:rtl w:val="0"/>
+        </w:rPr>
+        <w:t xml:space="preserve">Comprobaciones de integridad de información crítica.</w:t>
+      </w:r>
+      <w:r>
+        <w:rPr>
+          <w:rtl w:val="0"/>
+        </w:rPr>
+      </w:r>
+    </w:p>
+    <w:p>
+      <w:pPr>
+        <w:pStyle w:val="Heading3"/>
+        <w:jc w:val="both"/>
+        <w:rPr>
+          <w:rFonts w:ascii="Calibri" w:cs="Calibri" w:eastAsia="Calibri" w:hAnsi="Calibri"/>
+        </w:rPr>
+      </w:pPr>
+      <w:bookmarkStart w:colFirst="0" w:colLast="0" w:name="_heading=h.qbymxiv5vq8p" w:id="26"/>
+      <w:bookmarkEnd w:id="26"/>
+      <w:r>
+        <w:rPr>
+          <w:rFonts w:ascii="Calibri" w:cs="Calibri" w:eastAsia="Calibri" w:hAnsi="Calibri"/>
+          <w:rtl w:val="0"/>
+        </w:rPr>
+        <w:t xml:space="preserve">3.3.3</w:t>
+        <w:tab/>
+        <w:t xml:space="preserve">Fiabilidad</w:t>
+      </w:r>
+    </w:p>
+    <w:p>
+      <w:pPr>
+        <w:jc w:val="both"/>
+        <w:rPr>
+          <w:color w:val="ff0000"/>
+        </w:rPr>
+      </w:pPr>
+      <w:r>
+        <w:rPr>
+          <w:color w:val="ff0000"/>
+          <w:rtl w:val="0"/>
+        </w:rPr>
+        <w:t xml:space="preserve">Especificación de los factores de fiabilidad necesaria del sistema. Esto se expresa generalmente como el tiempo entre los incidentes permisibles, o el total de incidentes permisible.</w:t>
+      </w:r>
+    </w:p>
+    <w:p>
+      <w:pPr>
+        <w:rPr/>
+      </w:pPr>
+      <w:r>
+        <w:rPr>
+          <w:rtl w:val="0"/>
+        </w:rPr>
+      </w:r>
+    </w:p>
+    <w:p>
+      <w:pPr>
+        <w:pStyle w:val="Heading3"/>
+        <w:jc w:val="both"/>
+        <w:rPr>
+          <w:rFonts w:ascii="Calibri" w:cs="Calibri" w:eastAsia="Calibri" w:hAnsi="Calibri"/>
+        </w:rPr>
+      </w:pPr>
+      <w:bookmarkStart w:colFirst="0" w:colLast="0" w:name="_heading=h.hwkvftjt4nm7" w:id="27"/>
+      <w:bookmarkEnd w:id="27"/>
+      <w:r>
+        <w:rPr>
+          <w:rFonts w:ascii="Calibri" w:cs="Calibri" w:eastAsia="Calibri" w:hAnsi="Calibri"/>
+          <w:rtl w:val="0"/>
+        </w:rPr>
+        <w:t xml:space="preserve">3.3.4</w:t>
+        <w:tab/>
+        <w:t xml:space="preserve">Disponibilidad</w:t>
+      </w:r>
+    </w:p>
+    <w:p>
+      <w:pPr>
+        <w:jc w:val="both"/>
+        <w:rPr>
+          <w:color w:val="ff0000"/>
+        </w:rPr>
+      </w:pPr>
+      <w:r>
+        <w:rPr>
+          <w:color w:val="ff0000"/>
+          <w:rtl w:val="0"/>
+        </w:rPr>
+        <w:t xml:space="preserve">Especificación de los factores de disponibilidad final exigidos al sistema. Normalmente expresados en % de tiempo en los que el software tiene que mostrar disponibilidad.</w:t>
+      </w:r>
+    </w:p>
+    <w:p>
+      <w:pPr>
+        <w:pStyle w:val="Heading3"/>
+        <w:jc w:val="both"/>
+        <w:rPr>
+          <w:rFonts w:ascii="Calibri" w:cs="Calibri" w:eastAsia="Calibri" w:hAnsi="Calibri"/>
+        </w:rPr>
+      </w:pPr>
+      <w:bookmarkStart w:colFirst="0" w:colLast="0" w:name="_heading=h.ww443gifhf08" w:id="28"/>
+      <w:bookmarkEnd w:id="28"/>
+      <w:r>
+        <w:rPr>
+          <w:rFonts w:ascii="Calibri" w:cs="Calibri" w:eastAsia="Calibri" w:hAnsi="Calibri"/>
+          <w:rtl w:val="0"/>
+        </w:rPr>
+        <w:t xml:space="preserve">3.3.5</w:t>
+        <w:tab/>
+        <w:t xml:space="preserve">Mantenibilidad</w:t>
+      </w:r>
+    </w:p>
+    <w:p>
+      <w:pPr>
+        <w:jc w:val="both"/>
+        <w:rPr>
+          <w:color w:val="ff0000"/>
+        </w:rPr>
+      </w:pPr>
+      <w:r>
+        <w:rPr>
+          <w:color w:val="ff0000"/>
+          <w:rtl w:val="0"/>
+        </w:rPr>
+        <w:t xml:space="preserve">Identificación del tipo de mantenimiento necesario del sistema. </w:t>
+      </w:r>
+    </w:p>
+    <w:p>
+      <w:pPr>
+        <w:jc w:val="both"/>
+        <w:rPr>
+          <w:color w:val="ff0000"/>
+        </w:rPr>
+      </w:pPr>
+      <w:r>
+        <w:rPr>
+          <w:color w:val="ff0000"/>
+          <w:rtl w:val="0"/>
+        </w:rPr>
+        <w:t xml:space="preserve">Especificación de quien debe realizar las tareas de mantenimiento, por ejemplo usuarios, o un desarrollador.</w:t>
+      </w:r>
+    </w:p>
+    <w:p>
+      <w:pPr>
+        <w:jc w:val="both"/>
+        <w:rPr>
+          <w:color w:val="ff0000"/>
+        </w:rPr>
+      </w:pPr>
+      <w:r>
+        <w:rPr>
+          <w:color w:val="ff0000"/>
+          <w:rtl w:val="0"/>
+        </w:rPr>
+        <w:t xml:space="preserve">Especificación de cuándo debe realizarse las tareas de mantenimiento. Por ejemplo, generación de estadísticas de acceso semanales y mensuales.</w:t>
+      </w:r>
+    </w:p>
+    <w:p>
+      <w:pPr>
+        <w:pStyle w:val="Heading3"/>
+        <w:jc w:val="both"/>
+        <w:rPr>
+          <w:rFonts w:ascii="Calibri" w:cs="Calibri" w:eastAsia="Calibri" w:hAnsi="Calibri"/>
+        </w:rPr>
+      </w:pPr>
+      <w:bookmarkStart w:colFirst="0" w:colLast="0" w:name="_heading=h.g5sz8tuqtyx6" w:id="29"/>
+      <w:bookmarkEnd w:id="29"/>
+      <w:r>
+        <w:rPr>
+          <w:rFonts w:ascii="Calibri" w:cs="Calibri" w:eastAsia="Calibri" w:hAnsi="Calibri"/>
+          <w:rtl w:val="0"/>
+        </w:rPr>
+        <w:t xml:space="preserve">3.3.6</w:t>
+        <w:tab/>
+        <w:t xml:space="preserve">Portabilidad</w:t>
+      </w:r>
+    </w:p>
+    <w:p>
+      <w:pPr>
+        <w:jc w:val="both"/>
+        <w:rPr>
+          <w:color w:val="ff0000"/>
+        </w:rPr>
+      </w:pPr>
+      <w:r>
+        <w:rPr>
+          <w:color w:val="ff0000"/>
+          <w:rtl w:val="0"/>
+        </w:rPr>
+        <w:t xml:space="preserve">Especificación de atributos que debe presentar el software para facilitar su traslado a otras plataformas u entornos. Pueden incluirse:</w:t>
       </w:r>
     </w:p>
     <w:p>
@@ -7752,7 +9234,12 @@
           <w:vertAlign w:val="baseline"/>
           <w:rtl w:val="0"/>
         </w:rPr>
-        <w:t xml:space="preserve">Comprobación de validez de las entradas</w:t>
+        <w:t xml:space="preserve">Porcentaje de componentes dependientes del servidor.</w:t>
+      </w:r>
+      <w:r>
+        <w:rPr>
+          <w:rtl w:val="0"/>
+        </w:rPr>
       </w:r>
     </w:p>
     <w:p>
@@ -7807,7 +9294,12 @@
           <w:vertAlign w:val="baseline"/>
           <w:rtl w:val="0"/>
         </w:rPr>
-        <w:t xml:space="preserve">Secuencia exacta de operaciones</w:t>
+        <w:t xml:space="preserve">Porcentaje de código dependiente del servidor.</w:t>
+      </w:r>
+      <w:r>
+        <w:rPr>
+          <w:rtl w:val="0"/>
+        </w:rPr>
       </w:r>
     </w:p>
     <w:p>
@@ -7862,7 +9354,12 @@
           <w:vertAlign w:val="baseline"/>
           <w:rtl w:val="0"/>
         </w:rPr>
-        <w:t xml:space="preserve">Respuesta a situaciones anormales (desbordamientos, comunicaciones, recuperación de errores)</w:t>
+        <w:t xml:space="preserve">Uso de un determinado lenguaje por su portabilidad.</w:t>
+      </w:r>
+      <w:r>
+        <w:rPr>
+          <w:rtl w:val="0"/>
+        </w:rPr>
       </w:r>
     </w:p>
     <w:p>
@@ -7917,117 +9414,12 @@
           <w:vertAlign w:val="baseline"/>
           <w:rtl w:val="0"/>
         </w:rPr>
-        <w:t xml:space="preserve">Parámetros</w:t>
-      </w:r>
-    </w:p>
-    <w:p>
-      <w:pPr>
-        <w:keepNext w:val="0"/>
-        <w:keepLines w:val="0"/>
-        <w:pageBreakBefore w:val="0"/>
-        <w:widowControl w:val="1"/>
-        <w:numPr>
-          <w:ilvl w:val="0"/>
-          <w:numId w:val="6"/>
-        </w:numPr>
-        <w:pBdr>
-          <w:top w:space="0" w:sz="0" w:val="nil"/>
-          <w:left w:space="0" w:sz="0" w:val="nil"/>
-          <w:bottom w:space="0" w:sz="0" w:val="nil"/>
-          <w:right w:space="0" w:sz="0" w:val="nil"/>
-          <w:between w:space="0" w:sz="0" w:val="nil"/>
-        </w:pBdr>
-        <w:shd w:fill="auto" w:val="clear"/>
-        <w:spacing w:after="0" w:before="0" w:line="276" w:lineRule="auto"/>
-        <w:ind w:left="720" w:right="0" w:hanging="360"/>
-        <w:jc w:val="both"/>
-        <w:rPr>
-          <w:b w:val="0"/>
-          <w:bCs w:val="0"/>
-          <w:i w:val="0"/>
-          <w:iCs w:val="0"/>
-          <w:smallCaps w:val="0"/>
-          <w:strike w:val="0"/>
-          <w:color w:val="ff0000"/>
-          <w:sz w:val="22"/>
-          <w:szCs w:val="22"/>
-          <w:shd w:fill="auto" w:val="clear"/>
-          <w:vertAlign w:val="baseline"/>
-        </w:rPr>
-      </w:pPr>
-      <w:r>
-        <w:rPr>
-          <w:rFonts w:ascii="Calibri" w:cs="Calibri" w:eastAsia="Calibri" w:hAnsi="Calibri"/>
-          <w:b w:val="0"/>
-          <w:bCs w:val="0"/>
-          <w:i w:val="0"/>
-          <w:iCs w:val="0"/>
-          <w:smallCaps w:val="0"/>
-          <w:strike w:val="0"/>
-          <w:color w:val="ff0000"/>
-          <w:sz w:val="22"/>
-          <w:szCs w:val="22"/>
-          <w:u w:val="none"/>
-          <w:shd w:fill="auto" w:val="clear"/>
-          <w:vertAlign w:val="baseline"/>
-          <w:rtl w:val="0"/>
-        </w:rPr>
-        <w:t xml:space="preserve">Generación de salidas</w:t>
-      </w:r>
-    </w:p>
-    <w:p>
-      <w:pPr>
-        <w:keepNext w:val="0"/>
-        <w:keepLines w:val="0"/>
-        <w:pageBreakBefore w:val="0"/>
-        <w:widowControl w:val="1"/>
-        <w:numPr>
-          <w:ilvl w:val="0"/>
-          <w:numId w:val="6"/>
-        </w:numPr>
-        <w:pBdr>
-          <w:top w:space="0" w:sz="0" w:val="nil"/>
-          <w:left w:space="0" w:sz="0" w:val="nil"/>
-          <w:bottom w:space="0" w:sz="0" w:val="nil"/>
-          <w:right w:space="0" w:sz="0" w:val="nil"/>
-          <w:between w:space="0" w:sz="0" w:val="nil"/>
-        </w:pBdr>
-        <w:shd w:fill="auto" w:val="clear"/>
-        <w:spacing w:after="0" w:before="0" w:line="276" w:lineRule="auto"/>
-        <w:ind w:left="720" w:right="0" w:hanging="360"/>
-        <w:jc w:val="both"/>
-        <w:rPr>
-          <w:b w:val="0"/>
-          <w:bCs w:val="0"/>
-          <w:i w:val="0"/>
-          <w:iCs w:val="0"/>
-          <w:smallCaps w:val="0"/>
-          <w:strike w:val="0"/>
-          <w:color w:val="ff0000"/>
-          <w:sz w:val="22"/>
-          <w:szCs w:val="22"/>
-          <w:shd w:fill="auto" w:val="clear"/>
-          <w:vertAlign w:val="baseline"/>
-        </w:rPr>
-      </w:pPr>
-      <w:r>
-        <w:rPr>
-          <w:rFonts w:ascii="Calibri" w:cs="Calibri" w:eastAsia="Calibri" w:hAnsi="Calibri"/>
-          <w:b w:val="0"/>
-          <w:bCs w:val="0"/>
-          <w:i w:val="0"/>
-          <w:iCs w:val="0"/>
-          <w:smallCaps w:val="0"/>
-          <w:strike w:val="0"/>
-          <w:color w:val="ff0000"/>
-          <w:sz w:val="22"/>
-          <w:szCs w:val="22"/>
-          <w:u w:val="none"/>
-          <w:shd w:fill="auto" w:val="clear"/>
-          <w:vertAlign w:val="baseline"/>
-          <w:rtl w:val="0"/>
-        </w:rPr>
-        <w:t xml:space="preserve">Relaciones entre entradas y salidas (secuencias de entradas y salidas, fórmulas para la conversión de información)</w:t>
+        <w:t xml:space="preserve">Uso de un determinado compilador o plataforma de desarrollo.</w:t>
+      </w:r>
+      <w:r>
+        <w:rPr>
+          <w:rtl w:val="0"/>
+        </w:rPr>
       </w:r>
     </w:p>
     <w:p>
@@ -8082,882 +9474,12 @@
           <w:vertAlign w:val="baseline"/>
           <w:rtl w:val="0"/>
         </w:rPr>
-        <w:t xml:space="preserve">Especificación de los requisitos lógicos para la información que será  almacenada en base de datos (tipo de información, requerido)</w:t>
-      </w:r>
-    </w:p>
-    <w:p>
-      <w:pPr>
-        <w:jc w:val="both"/>
-        <w:rPr>
-          <w:color w:val="ff0000"/>
-        </w:rPr>
-      </w:pPr>
-      <w:r>
-        <w:rPr>
-          <w:color w:val="ff0000"/>
-          <w:rtl w:val="0"/>
-        </w:rPr>
-        <w:t xml:space="preserve">Los requisitos funcionales pueden ser divididos en sub-secciones.</w:t>
-      </w:r>
-    </w:p>
-    <w:p>
-      <w:pPr>
-        <w:rPr>
-          <w:color w:val="ff0000"/>
-        </w:rPr>
-      </w:pPr>
-      <w:r>
-        <w:rPr>
-          <w:rtl w:val="0"/>
-        </w:rPr>
-      </w:r>
-    </w:p>
-    <w:p>
-      <w:pPr>
-        <w:pStyle w:val="Heading2"/>
-        <w:jc w:val="both"/>
-        <w:rPr>
-          <w:rFonts w:ascii="Calibri" w:cs="Calibri" w:eastAsia="Calibri" w:hAnsi="Calibri"/>
-        </w:rPr>
-      </w:pPr>
-      <w:bookmarkStart w:colFirst="0" w:colLast="0" w:name="_heading=h.zcpzwpioejr5" w:id="23"/>
-      <w:bookmarkEnd w:id="23"/>
-      <w:r>
-        <w:rPr>
-          <w:rFonts w:ascii="Calibri" w:cs="Calibri" w:eastAsia="Calibri" w:hAnsi="Calibri"/>
-          <w:rtl w:val="0"/>
-        </w:rPr>
-        <w:t xml:space="preserve">3.3</w:t>
-        <w:tab/>
-        <w:t xml:space="preserve">Requisitos no funcionales</w:t>
-      </w:r>
-    </w:p>
-    <w:p>
-      <w:pPr>
-        <w:pStyle w:val="Heading3"/>
-        <w:jc w:val="both"/>
-        <w:rPr>
-          <w:rFonts w:ascii="Calibri" w:cs="Calibri" w:eastAsia="Calibri" w:hAnsi="Calibri"/>
-        </w:rPr>
-      </w:pPr>
-      <w:bookmarkStart w:colFirst="0" w:colLast="0" w:name="_heading=h.dn4gxhgvzmg4" w:id="24"/>
-      <w:bookmarkEnd w:id="24"/>
-      <w:r>
-        <w:rPr>
-          <w:rFonts w:ascii="Calibri" w:cs="Calibri" w:eastAsia="Calibri" w:hAnsi="Calibri"/>
-          <w:rtl w:val="0"/>
-        </w:rPr>
-        <w:t xml:space="preserve">3.3.1</w:t>
-        <w:tab/>
-        <w:t xml:space="preserve">Requisitos de rendimiento</w:t>
-      </w:r>
-    </w:p>
-    <w:p>
-      <w:pPr>
-        <w:jc w:val="both"/>
-        <w:rPr>
-          <w:b w:val="1"/>
-          <w:bCs w:val="1"/>
-          <w:color w:val="ff0000"/>
-        </w:rPr>
-      </w:pPr>
-      <w:r>
-        <w:rPr>
-          <w:b w:val="1"/>
-          <w:bCs w:val="1"/>
-          <w:color w:val="ff0000"/>
-          <w:rtl w:val="0"/>
-        </w:rPr>
-        <w:t xml:space="preserve">Especificación de los requisitos relacionados con la carga que se espera tenga que soportar el sistema. Por ejemplo, el número de terminales, el número esperado de usuarios simultáneamente conectados, número de transacciones por segundo que deberá soportar el sistema, etc.</w:t>
-      </w:r>
-    </w:p>
-    <w:p>
-      <w:pPr>
-        <w:jc w:val="both"/>
-        <w:rPr>
-          <w:b w:val="1"/>
-          <w:bCs w:val="1"/>
-          <w:color w:val="ff0000"/>
-        </w:rPr>
-      </w:pPr>
-      <w:r>
-        <w:rPr>
-          <w:b w:val="1"/>
-          <w:bCs w:val="1"/>
-          <w:color w:val="ff0000"/>
-          <w:rtl w:val="0"/>
-        </w:rPr>
-        <w:t xml:space="preserve">Todos estos requisitos deben ser mesurables. Por ejemplo, indicando “el 95% de las transacciones deben realizarse en menos de 1 segundo”, en lugar de “los operadores no deben esperar a que se complete la transacción”.</w:t>
-      </w:r>
-    </w:p>
-    <w:p>
-      <w:pPr>
-        <w:pStyle w:val="Heading3"/>
-        <w:jc w:val="both"/>
-        <w:rPr>
-          <w:rFonts w:ascii="Calibri" w:cs="Calibri" w:eastAsia="Calibri" w:hAnsi="Calibri"/>
-        </w:rPr>
-      </w:pPr>
-      <w:bookmarkStart w:colFirst="0" w:colLast="0" w:name="_heading=h.oyrp4hdi48n6" w:id="25"/>
-      <w:bookmarkEnd w:id="25"/>
-      <w:r>
-        <w:rPr>
-          <w:rFonts w:ascii="Calibri" w:cs="Calibri" w:eastAsia="Calibri" w:hAnsi="Calibri"/>
-          <w:rtl w:val="0"/>
-        </w:rPr>
-        <w:t xml:space="preserve">3.3.2</w:t>
-        <w:tab/>
-        <w:t xml:space="preserve">Seguridad</w:t>
-      </w:r>
-    </w:p>
-    <w:p>
-      <w:pPr>
-        <w:jc w:val="both"/>
-        <w:rPr>
-          <w:color w:val="ff0000"/>
-        </w:rPr>
-      </w:pPr>
-      <w:r>
-        <w:rPr>
-          <w:color w:val="ff0000"/>
-          <w:rtl w:val="0"/>
-        </w:rPr>
-        <w:t xml:space="preserve">Especificación de elementos que protegerán al software de accesos, usos y sabotajes maliciosos, así como de modificaciones o destrucciones maliciosas o accidentales. Los requisitos pueden especificar:</w:t>
-      </w:r>
-    </w:p>
-    <w:p>
-      <w:pPr>
-        <w:keepNext w:val="0"/>
-        <w:keepLines w:val="0"/>
-        <w:pageBreakBefore w:val="0"/>
-        <w:widowControl w:val="1"/>
-        <w:numPr>
-          <w:ilvl w:val="0"/>
-          <w:numId w:val="7"/>
-        </w:numPr>
-        <w:pBdr>
-          <w:top w:space="0" w:sz="0" w:val="nil"/>
-          <w:left w:space="0" w:sz="0" w:val="nil"/>
-          <w:bottom w:space="0" w:sz="0" w:val="nil"/>
-          <w:right w:space="0" w:sz="0" w:val="nil"/>
-          <w:between w:space="0" w:sz="0" w:val="nil"/>
-        </w:pBdr>
-        <w:shd w:fill="auto" w:val="clear"/>
-        <w:spacing w:after="0" w:before="0" w:line="276" w:lineRule="auto"/>
-        <w:ind w:left="720" w:right="0" w:hanging="360"/>
-        <w:jc w:val="both"/>
-        <w:rPr>
-          <w:b w:val="0"/>
-          <w:bCs w:val="0"/>
-          <w:i w:val="0"/>
-          <w:iCs w:val="0"/>
-          <w:smallCaps w:val="0"/>
-          <w:strike w:val="0"/>
-          <w:color w:val="ff0000"/>
-          <w:sz w:val="22"/>
-          <w:szCs w:val="22"/>
-          <w:shd w:fill="auto" w:val="clear"/>
-          <w:vertAlign w:val="baseline"/>
-        </w:rPr>
-      </w:pPr>
-      <w:r>
-        <w:rPr>
-          <w:rFonts w:ascii="Calibri" w:cs="Calibri" w:eastAsia="Calibri" w:hAnsi="Calibri"/>
-          <w:b w:val="0"/>
-          <w:bCs w:val="0"/>
-          <w:i w:val="0"/>
-          <w:iCs w:val="0"/>
-          <w:smallCaps w:val="0"/>
-          <w:strike w:val="0"/>
-          <w:color w:val="ff0000"/>
-          <w:sz w:val="22"/>
-          <w:szCs w:val="22"/>
-          <w:u w:val="none"/>
-          <w:shd w:fill="auto" w:val="clear"/>
-          <w:vertAlign w:val="baseline"/>
-          <w:rtl w:val="0"/>
-        </w:rPr>
-        <w:t xml:space="preserve">Empleo de técnicas criptográficas.</w:t>
-      </w:r>
-    </w:p>
-    <w:p>
-      <w:pPr>
-        <w:keepNext w:val="0"/>
-        <w:keepLines w:val="0"/>
-        <w:pageBreakBefore w:val="0"/>
-        <w:widowControl w:val="1"/>
-        <w:numPr>
-          <w:ilvl w:val="0"/>
-          <w:numId w:val="7"/>
-        </w:numPr>
-        <w:pBdr>
-          <w:top w:space="0" w:sz="0" w:val="nil"/>
-          <w:left w:space="0" w:sz="0" w:val="nil"/>
-          <w:bottom w:space="0" w:sz="0" w:val="nil"/>
-          <w:right w:space="0" w:sz="0" w:val="nil"/>
-          <w:between w:space="0" w:sz="0" w:val="nil"/>
-        </w:pBdr>
-        <w:shd w:fill="auto" w:val="clear"/>
-        <w:spacing w:after="0" w:before="0" w:line="276" w:lineRule="auto"/>
-        <w:ind w:left="720" w:right="0" w:hanging="360"/>
-        <w:jc w:val="both"/>
-        <w:rPr>
-          <w:b w:val="0"/>
-          <w:bCs w:val="0"/>
-          <w:i w:val="0"/>
-          <w:iCs w:val="0"/>
-          <w:smallCaps w:val="0"/>
-          <w:strike w:val="0"/>
-          <w:color w:val="ff0000"/>
-          <w:sz w:val="22"/>
-          <w:szCs w:val="22"/>
-          <w:shd w:fill="auto" w:val="clear"/>
-          <w:vertAlign w:val="baseline"/>
-        </w:rPr>
-      </w:pPr>
-      <w:r>
-        <w:rPr>
-          <w:rFonts w:ascii="Calibri" w:cs="Calibri" w:eastAsia="Calibri" w:hAnsi="Calibri"/>
-          <w:b w:val="0"/>
-          <w:bCs w:val="0"/>
-          <w:i w:val="0"/>
-          <w:iCs w:val="0"/>
-          <w:smallCaps w:val="0"/>
-          <w:strike w:val="0"/>
-          <w:color w:val="ff0000"/>
-          <w:sz w:val="22"/>
-          <w:szCs w:val="22"/>
-          <w:u w:val="none"/>
-          <w:shd w:fill="auto" w:val="clear"/>
-          <w:vertAlign w:val="baseline"/>
-          <w:rtl w:val="0"/>
-        </w:rPr>
-        <w:t xml:space="preserve">Registro de ficheros con “logs” de actividad.</w:t>
-      </w:r>
-    </w:p>
-    <w:p>
-      <w:pPr>
-        <w:keepNext w:val="0"/>
-        <w:keepLines w:val="0"/>
-        <w:pageBreakBefore w:val="0"/>
-        <w:widowControl w:val="1"/>
-        <w:numPr>
-          <w:ilvl w:val="0"/>
-          <w:numId w:val="7"/>
-        </w:numPr>
-        <w:pBdr>
-          <w:top w:space="0" w:sz="0" w:val="nil"/>
-          <w:left w:space="0" w:sz="0" w:val="nil"/>
-          <w:bottom w:space="0" w:sz="0" w:val="nil"/>
-          <w:right w:space="0" w:sz="0" w:val="nil"/>
-          <w:between w:space="0" w:sz="0" w:val="nil"/>
-        </w:pBdr>
-        <w:shd w:fill="auto" w:val="clear"/>
-        <w:spacing w:after="0" w:before="0" w:line="276" w:lineRule="auto"/>
-        <w:ind w:left="720" w:right="0" w:hanging="360"/>
-        <w:jc w:val="both"/>
-        <w:rPr>
-          <w:b w:val="0"/>
-          <w:bCs w:val="0"/>
-          <w:i w:val="0"/>
-          <w:iCs w:val="0"/>
-          <w:smallCaps w:val="0"/>
-          <w:strike w:val="0"/>
-          <w:color w:val="ff0000"/>
-          <w:sz w:val="22"/>
-          <w:szCs w:val="22"/>
-          <w:shd w:fill="auto" w:val="clear"/>
-          <w:vertAlign w:val="baseline"/>
-        </w:rPr>
-      </w:pPr>
-      <w:r>
-        <w:rPr>
-          <w:rFonts w:ascii="Calibri" w:cs="Calibri" w:eastAsia="Calibri" w:hAnsi="Calibri"/>
-          <w:b w:val="0"/>
-          <w:bCs w:val="0"/>
-          <w:i w:val="0"/>
-          <w:iCs w:val="0"/>
-          <w:smallCaps w:val="0"/>
-          <w:strike w:val="0"/>
-          <w:color w:val="ff0000"/>
-          <w:sz w:val="22"/>
-          <w:szCs w:val="22"/>
-          <w:u w:val="none"/>
-          <w:shd w:fill="auto" w:val="clear"/>
-          <w:vertAlign w:val="baseline"/>
-          <w:rtl w:val="0"/>
-        </w:rPr>
-        <w:t xml:space="preserve">Asignación de determinadas funcionalidades a determinados módulos.</w:t>
-      </w:r>
-    </w:p>
-    <w:p>
-      <w:pPr>
-        <w:keepNext w:val="0"/>
-        <w:keepLines w:val="0"/>
-        <w:pageBreakBefore w:val="0"/>
-        <w:widowControl w:val="1"/>
-        <w:numPr>
-          <w:ilvl w:val="0"/>
-          <w:numId w:val="7"/>
-        </w:numPr>
-        <w:pBdr>
-          <w:top w:space="0" w:sz="0" w:val="nil"/>
-          <w:left w:space="0" w:sz="0" w:val="nil"/>
-          <w:bottom w:space="0" w:sz="0" w:val="nil"/>
-          <w:right w:space="0" w:sz="0" w:val="nil"/>
-          <w:between w:space="0" w:sz="0" w:val="nil"/>
-        </w:pBdr>
-        <w:shd w:fill="auto" w:val="clear"/>
-        <w:spacing w:after="0" w:before="0" w:line="276" w:lineRule="auto"/>
-        <w:ind w:left="720" w:right="0" w:hanging="360"/>
-        <w:jc w:val="both"/>
-        <w:rPr>
-          <w:b w:val="0"/>
-          <w:bCs w:val="0"/>
-          <w:i w:val="0"/>
-          <w:iCs w:val="0"/>
-          <w:smallCaps w:val="0"/>
-          <w:strike w:val="0"/>
-          <w:color w:val="ff0000"/>
-          <w:sz w:val="22"/>
-          <w:szCs w:val="22"/>
-          <w:shd w:fill="auto" w:val="clear"/>
-          <w:vertAlign w:val="baseline"/>
-        </w:rPr>
-      </w:pPr>
-      <w:r>
-        <w:rPr>
-          <w:rFonts w:ascii="Calibri" w:cs="Calibri" w:eastAsia="Calibri" w:hAnsi="Calibri"/>
-          <w:b w:val="0"/>
-          <w:bCs w:val="0"/>
-          <w:i w:val="0"/>
-          <w:iCs w:val="0"/>
-          <w:smallCaps w:val="0"/>
-          <w:strike w:val="0"/>
-          <w:color w:val="ff0000"/>
-          <w:sz w:val="22"/>
-          <w:szCs w:val="22"/>
-          <w:u w:val="none"/>
-          <w:shd w:fill="auto" w:val="clear"/>
-          <w:vertAlign w:val="baseline"/>
-          <w:rtl w:val="0"/>
-        </w:rPr>
-        <w:t xml:space="preserve">Restricciones de comunicación entre determinados módulos.</w:t>
-      </w:r>
-    </w:p>
-    <w:p>
-      <w:pPr>
-        <w:keepNext w:val="0"/>
-        <w:keepLines w:val="0"/>
-        <w:pageBreakBefore w:val="0"/>
-        <w:widowControl w:val="1"/>
-        <w:numPr>
-          <w:ilvl w:val="0"/>
-          <w:numId w:val="7"/>
-        </w:numPr>
-        <w:pBdr>
-          <w:top w:space="0" w:sz="0" w:val="nil"/>
-          <w:left w:space="0" w:sz="0" w:val="nil"/>
-          <w:bottom w:space="0" w:sz="0" w:val="nil"/>
-          <w:right w:space="0" w:sz="0" w:val="nil"/>
-          <w:between w:space="0" w:sz="0" w:val="nil"/>
-        </w:pBdr>
-        <w:shd w:fill="auto" w:val="clear"/>
-        <w:spacing w:after="200" w:before="0" w:line="276" w:lineRule="auto"/>
-        <w:ind w:left="720" w:right="0" w:hanging="360"/>
-        <w:jc w:val="both"/>
-        <w:rPr>
-          <w:b w:val="0"/>
-          <w:bCs w:val="0"/>
-          <w:i w:val="0"/>
-          <w:iCs w:val="0"/>
-          <w:smallCaps w:val="0"/>
-          <w:strike w:val="0"/>
-          <w:color w:val="ff0000"/>
-          <w:sz w:val="22"/>
-          <w:szCs w:val="22"/>
-          <w:shd w:fill="auto" w:val="clear"/>
-          <w:vertAlign w:val="baseline"/>
-        </w:rPr>
-      </w:pPr>
-      <w:r>
-        <w:rPr>
-          <w:rFonts w:ascii="Calibri" w:cs="Calibri" w:eastAsia="Calibri" w:hAnsi="Calibri"/>
-          <w:b w:val="0"/>
-          <w:bCs w:val="0"/>
-          <w:i w:val="0"/>
-          <w:iCs w:val="0"/>
-          <w:smallCaps w:val="0"/>
-          <w:strike w:val="0"/>
-          <w:color w:val="ff0000"/>
-          <w:sz w:val="22"/>
-          <w:szCs w:val="22"/>
-          <w:u w:val="none"/>
-          <w:shd w:fill="auto" w:val="clear"/>
-          <w:vertAlign w:val="baseline"/>
-          <w:rtl w:val="0"/>
-        </w:rPr>
-        <w:t xml:space="preserve">Comprobaciones de integridad de información crítica.</w:t>
-      </w:r>
-      <w:r>
-        <w:rPr>
-          <w:rtl w:val="0"/>
-        </w:rPr>
-      </w:r>
-    </w:p>
-    <w:p>
-      <w:pPr>
-        <w:pStyle w:val="Heading3"/>
-        <w:jc w:val="both"/>
-        <w:rPr>
-          <w:rFonts w:ascii="Calibri" w:cs="Calibri" w:eastAsia="Calibri" w:hAnsi="Calibri"/>
-        </w:rPr>
-      </w:pPr>
-      <w:bookmarkStart w:colFirst="0" w:colLast="0" w:name="_heading=h.qbymxiv5vq8p" w:id="26"/>
-      <w:bookmarkEnd w:id="26"/>
-      <w:r>
-        <w:rPr>
-          <w:rFonts w:ascii="Calibri" w:cs="Calibri" w:eastAsia="Calibri" w:hAnsi="Calibri"/>
-          <w:rtl w:val="0"/>
-        </w:rPr>
-        <w:t xml:space="preserve">3.3.3</w:t>
-        <w:tab/>
-        <w:t xml:space="preserve">Fiabilidad</w:t>
-      </w:r>
-    </w:p>
-    <w:p>
-      <w:pPr>
-        <w:jc w:val="both"/>
-        <w:rPr>
-          <w:color w:val="ff0000"/>
-        </w:rPr>
-      </w:pPr>
-      <w:r>
-        <w:rPr>
-          <w:color w:val="ff0000"/>
-          <w:rtl w:val="0"/>
-        </w:rPr>
-        <w:t xml:space="preserve">Especificación de los factores de fiabilidad necesaria del sistema. Esto se expresa generalmente como el tiempo entre los incidentes permisibles, o el total de incidentes permisible.</w:t>
-      </w:r>
-    </w:p>
-    <w:p>
-      <w:pPr>
-        <w:rPr/>
-      </w:pPr>
-      <w:r>
-        <w:rPr>
-          <w:rtl w:val="0"/>
-        </w:rPr>
-      </w:r>
-    </w:p>
-    <w:p>
-      <w:pPr>
-        <w:pStyle w:val="Heading3"/>
-        <w:jc w:val="both"/>
-        <w:rPr>
-          <w:rFonts w:ascii="Calibri" w:cs="Calibri" w:eastAsia="Calibri" w:hAnsi="Calibri"/>
-        </w:rPr>
-      </w:pPr>
-      <w:bookmarkStart w:colFirst="0" w:colLast="0" w:name="_heading=h.hwkvftjt4nm7" w:id="27"/>
-      <w:bookmarkEnd w:id="27"/>
-      <w:r>
-        <w:rPr>
-          <w:rFonts w:ascii="Calibri" w:cs="Calibri" w:eastAsia="Calibri" w:hAnsi="Calibri"/>
-          <w:rtl w:val="0"/>
-        </w:rPr>
-        <w:t xml:space="preserve">3.3.4</w:t>
-        <w:tab/>
-        <w:t xml:space="preserve">Disponibilidad</w:t>
-      </w:r>
-    </w:p>
-    <w:p>
-      <w:pPr>
-        <w:jc w:val="both"/>
-        <w:rPr>
-          <w:color w:val="ff0000"/>
-        </w:rPr>
-      </w:pPr>
-      <w:r>
-        <w:rPr>
-          <w:color w:val="ff0000"/>
-          <w:rtl w:val="0"/>
-        </w:rPr>
-        <w:t xml:space="preserve">Especificación de los factores de disponibilidad final exigidos al sistema. Normalmente expresados en % de tiempo en los que el software tiene que mostrar disponibilidad.</w:t>
-      </w:r>
-    </w:p>
-    <w:p>
-      <w:pPr>
-        <w:pStyle w:val="Heading3"/>
-        <w:jc w:val="both"/>
-        <w:rPr>
-          <w:rFonts w:ascii="Calibri" w:cs="Calibri" w:eastAsia="Calibri" w:hAnsi="Calibri"/>
-        </w:rPr>
-      </w:pPr>
-      <w:bookmarkStart w:colFirst="0" w:colLast="0" w:name="_heading=h.ww443gifhf08" w:id="28"/>
-      <w:bookmarkEnd w:id="28"/>
-      <w:r>
-        <w:rPr>
-          <w:rFonts w:ascii="Calibri" w:cs="Calibri" w:eastAsia="Calibri" w:hAnsi="Calibri"/>
-          <w:rtl w:val="0"/>
-        </w:rPr>
-        <w:t xml:space="preserve">3.3.5</w:t>
-        <w:tab/>
-        <w:t xml:space="preserve">Mantenibilidad</w:t>
-      </w:r>
-    </w:p>
-    <w:p>
-      <w:pPr>
-        <w:jc w:val="both"/>
-        <w:rPr>
-          <w:color w:val="ff0000"/>
-        </w:rPr>
-      </w:pPr>
-      <w:r>
-        <w:rPr>
-          <w:color w:val="ff0000"/>
-          <w:rtl w:val="0"/>
-        </w:rPr>
-        <w:t xml:space="preserve">Identificación del tipo de mantenimiento necesario del sistema. </w:t>
-      </w:r>
-    </w:p>
-    <w:p>
-      <w:pPr>
-        <w:jc w:val="both"/>
-        <w:rPr>
-          <w:color w:val="ff0000"/>
-        </w:rPr>
-      </w:pPr>
-      <w:r>
-        <w:rPr>
-          <w:color w:val="ff0000"/>
-          <w:rtl w:val="0"/>
-        </w:rPr>
-        <w:t xml:space="preserve">Especificación de quien debe realizar las tareas de mantenimiento, por ejemplo usuarios, o un desarrollador.</w:t>
-      </w:r>
-    </w:p>
-    <w:p>
-      <w:pPr>
-        <w:jc w:val="both"/>
-        <w:rPr>
-          <w:color w:val="ff0000"/>
-        </w:rPr>
-      </w:pPr>
-      <w:r>
-        <w:rPr>
-          <w:color w:val="ff0000"/>
-          <w:rtl w:val="0"/>
-        </w:rPr>
-        <w:t xml:space="preserve">Especificación de cuándo debe realizarse las tareas de mantenimiento. Por ejemplo, generación de estadísticas de acceso semanales y mensuales.</w:t>
-      </w:r>
-    </w:p>
-    <w:p>
-      <w:pPr>
-        <w:pStyle w:val="Heading3"/>
-        <w:jc w:val="both"/>
-        <w:rPr>
-          <w:rFonts w:ascii="Calibri" w:cs="Calibri" w:eastAsia="Calibri" w:hAnsi="Calibri"/>
-        </w:rPr>
-      </w:pPr>
-      <w:bookmarkStart w:colFirst="0" w:colLast="0" w:name="_heading=h.g5sz8tuqtyx6" w:id="29"/>
-      <w:bookmarkEnd w:id="29"/>
-      <w:r>
-        <w:rPr>
-          <w:rFonts w:ascii="Calibri" w:cs="Calibri" w:eastAsia="Calibri" w:hAnsi="Calibri"/>
-          <w:rtl w:val="0"/>
-        </w:rPr>
-        <w:t xml:space="preserve">3.3.6</w:t>
-        <w:tab/>
-        <w:t xml:space="preserve">Portabilidad</w:t>
-      </w:r>
-    </w:p>
-    <w:p>
-      <w:pPr>
-        <w:jc w:val="both"/>
-        <w:rPr>
-          <w:color w:val="ff0000"/>
-        </w:rPr>
-      </w:pPr>
-      <w:r>
-        <w:rPr>
-          <w:color w:val="ff0000"/>
-          <w:rtl w:val="0"/>
-        </w:rPr>
-        <w:t xml:space="preserve">Especificación de atributos que debe presentar el software para facilitar su traslado a otras plataformas u entornos. Pueden incluirse:</w:t>
-      </w:r>
-    </w:p>
-    <w:p>
-      <w:pPr>
-        <w:keepNext w:val="0"/>
-        <w:keepLines w:val="0"/>
-        <w:pageBreakBefore w:val="0"/>
-        <w:widowControl w:val="1"/>
-        <w:numPr>
-          <w:ilvl w:val="0"/>
-          <w:numId w:val="3"/>
-        </w:numPr>
-        <w:pBdr>
-          <w:top w:space="0" w:sz="0" w:val="nil"/>
-          <w:left w:space="0" w:sz="0" w:val="nil"/>
-          <w:bottom w:space="0" w:sz="0" w:val="nil"/>
-          <w:right w:space="0" w:sz="0" w:val="nil"/>
-          <w:between w:space="0" w:sz="0" w:val="nil"/>
-        </w:pBdr>
-        <w:shd w:fill="auto" w:val="clear"/>
-        <w:spacing w:after="0" w:before="0" w:line="276" w:lineRule="auto"/>
-        <w:ind w:left="720" w:right="0" w:hanging="360"/>
-        <w:jc w:val="both"/>
-        <w:rPr>
-          <w:b w:val="0"/>
-          <w:bCs w:val="0"/>
-          <w:i w:val="0"/>
-          <w:iCs w:val="0"/>
-          <w:smallCaps w:val="0"/>
-          <w:strike w:val="0"/>
-          <w:color w:val="ff0000"/>
-          <w:sz w:val="22"/>
-          <w:szCs w:val="22"/>
-          <w:shd w:fill="auto" w:val="clear"/>
-          <w:vertAlign w:val="baseline"/>
-        </w:rPr>
-      </w:pPr>
-      <w:r>
-        <w:rPr>
-          <w:rFonts w:ascii="Calibri" w:cs="Calibri" w:eastAsia="Calibri" w:hAnsi="Calibri"/>
-          <w:b w:val="0"/>
-          <w:bCs w:val="0"/>
-          <w:i w:val="0"/>
-          <w:iCs w:val="0"/>
-          <w:smallCaps w:val="0"/>
-          <w:strike w:val="0"/>
-          <w:color w:val="ff0000"/>
-          <w:sz w:val="22"/>
-          <w:szCs w:val="22"/>
-          <w:u w:val="none"/>
-          <w:shd w:fill="auto" w:val="clear"/>
-          <w:vertAlign w:val="baseline"/>
-          <w:rtl w:val="0"/>
-        </w:rPr>
-        <w:t xml:space="preserve">Porcentaje de componentes dependientes del servidor.</w:t>
-      </w:r>
-    </w:p>
-    <w:p>
-      <w:pPr>
-        <w:keepNext w:val="0"/>
-        <w:keepLines w:val="0"/>
-        <w:pageBreakBefore w:val="0"/>
-        <w:widowControl w:val="1"/>
-        <w:numPr>
-          <w:ilvl w:val="0"/>
-          <w:numId w:val="3"/>
-        </w:numPr>
-        <w:pBdr>
-          <w:top w:space="0" w:sz="0" w:val="nil"/>
-          <w:left w:space="0" w:sz="0" w:val="nil"/>
-          <w:bottom w:space="0" w:sz="0" w:val="nil"/>
-          <w:right w:space="0" w:sz="0" w:val="nil"/>
-          <w:between w:space="0" w:sz="0" w:val="nil"/>
-        </w:pBdr>
-        <w:shd w:fill="auto" w:val="clear"/>
-        <w:spacing w:after="0" w:before="0" w:line="276" w:lineRule="auto"/>
-        <w:ind w:left="720" w:right="0" w:hanging="360"/>
-        <w:jc w:val="both"/>
-        <w:rPr>
-          <w:b w:val="0"/>
-          <w:bCs w:val="0"/>
-          <w:i w:val="0"/>
-          <w:iCs w:val="0"/>
-          <w:smallCaps w:val="0"/>
-          <w:strike w:val="0"/>
-          <w:color w:val="ff0000"/>
-          <w:sz w:val="22"/>
-          <w:szCs w:val="22"/>
-          <w:shd w:fill="auto" w:val="clear"/>
-          <w:vertAlign w:val="baseline"/>
-        </w:rPr>
-      </w:pPr>
-      <w:r>
-        <w:rPr>
-          <w:rFonts w:ascii="Calibri" w:cs="Calibri" w:eastAsia="Calibri" w:hAnsi="Calibri"/>
-          <w:b w:val="0"/>
-          <w:bCs w:val="0"/>
-          <w:i w:val="0"/>
-          <w:iCs w:val="0"/>
-          <w:smallCaps w:val="0"/>
-          <w:strike w:val="0"/>
-          <w:color w:val="ff0000"/>
-          <w:sz w:val="22"/>
-          <w:szCs w:val="22"/>
-          <w:u w:val="none"/>
-          <w:shd w:fill="auto" w:val="clear"/>
-          <w:vertAlign w:val="baseline"/>
-          <w:rtl w:val="0"/>
-        </w:rPr>
-        <w:t xml:space="preserve">Porcentaje de código dependiente del servidor.</w:t>
-      </w:r>
-    </w:p>
-    <w:p>
-      <w:pPr>
-        <w:keepNext w:val="0"/>
-        <w:keepLines w:val="0"/>
-        <w:pageBreakBefore w:val="0"/>
-        <w:widowControl w:val="1"/>
-        <w:numPr>
-          <w:ilvl w:val="0"/>
-          <w:numId w:val="3"/>
-        </w:numPr>
-        <w:pBdr>
-          <w:top w:space="0" w:sz="0" w:val="nil"/>
-          <w:left w:space="0" w:sz="0" w:val="nil"/>
-          <w:bottom w:space="0" w:sz="0" w:val="nil"/>
-          <w:right w:space="0" w:sz="0" w:val="nil"/>
-          <w:between w:space="0" w:sz="0" w:val="nil"/>
-        </w:pBdr>
-        <w:shd w:fill="auto" w:val="clear"/>
-        <w:spacing w:after="0" w:before="0" w:line="276" w:lineRule="auto"/>
-        <w:ind w:left="720" w:right="0" w:hanging="360"/>
-        <w:jc w:val="both"/>
-        <w:rPr>
-          <w:b w:val="0"/>
-          <w:bCs w:val="0"/>
-          <w:i w:val="0"/>
-          <w:iCs w:val="0"/>
-          <w:smallCaps w:val="0"/>
-          <w:strike w:val="0"/>
-          <w:color w:val="ff0000"/>
-          <w:sz w:val="22"/>
-          <w:szCs w:val="22"/>
-          <w:shd w:fill="auto" w:val="clear"/>
-          <w:vertAlign w:val="baseline"/>
-        </w:rPr>
-      </w:pPr>
-      <w:r>
-        <w:rPr>
-          <w:rFonts w:ascii="Calibri" w:cs="Calibri" w:eastAsia="Calibri" w:hAnsi="Calibri"/>
-          <w:b w:val="0"/>
-          <w:bCs w:val="0"/>
-          <w:i w:val="0"/>
-          <w:iCs w:val="0"/>
-          <w:smallCaps w:val="0"/>
-          <w:strike w:val="0"/>
-          <w:color w:val="ff0000"/>
-          <w:sz w:val="22"/>
-          <w:szCs w:val="22"/>
-          <w:u w:val="none"/>
-          <w:shd w:fill="auto" w:val="clear"/>
-          <w:vertAlign w:val="baseline"/>
-          <w:rtl w:val="0"/>
-        </w:rPr>
-        <w:t xml:space="preserve">Uso de un determinado lenguaje por su portabilidad.</w:t>
-      </w:r>
-    </w:p>
-    <w:p>
-      <w:pPr>
-        <w:keepNext w:val="0"/>
-        <w:keepLines w:val="0"/>
-        <w:pageBreakBefore w:val="0"/>
-        <w:widowControl w:val="1"/>
-        <w:numPr>
-          <w:ilvl w:val="0"/>
-          <w:numId w:val="3"/>
-        </w:numPr>
-        <w:pBdr>
-          <w:top w:space="0" w:sz="0" w:val="nil"/>
-          <w:left w:space="0" w:sz="0" w:val="nil"/>
-          <w:bottom w:space="0" w:sz="0" w:val="nil"/>
-          <w:right w:space="0" w:sz="0" w:val="nil"/>
-          <w:between w:space="0" w:sz="0" w:val="nil"/>
-        </w:pBdr>
-        <w:shd w:fill="auto" w:val="clear"/>
-        <w:spacing w:after="0" w:before="0" w:line="276" w:lineRule="auto"/>
-        <w:ind w:left="720" w:right="0" w:hanging="360"/>
-        <w:jc w:val="both"/>
-        <w:rPr>
-          <w:b w:val="0"/>
-          <w:bCs w:val="0"/>
-          <w:i w:val="0"/>
-          <w:iCs w:val="0"/>
-          <w:smallCaps w:val="0"/>
-          <w:strike w:val="0"/>
-          <w:color w:val="ff0000"/>
-          <w:sz w:val="22"/>
-          <w:szCs w:val="22"/>
-          <w:shd w:fill="auto" w:val="clear"/>
-          <w:vertAlign w:val="baseline"/>
-        </w:rPr>
-      </w:pPr>
-      <w:r>
-        <w:rPr>
-          <w:rFonts w:ascii="Calibri" w:cs="Calibri" w:eastAsia="Calibri" w:hAnsi="Calibri"/>
-          <w:b w:val="0"/>
-          <w:bCs w:val="0"/>
-          <w:i w:val="0"/>
-          <w:iCs w:val="0"/>
-          <w:smallCaps w:val="0"/>
-          <w:strike w:val="0"/>
-          <w:color w:val="ff0000"/>
-          <w:sz w:val="22"/>
-          <w:szCs w:val="22"/>
-          <w:u w:val="none"/>
-          <w:shd w:fill="auto" w:val="clear"/>
-          <w:vertAlign w:val="baseline"/>
-          <w:rtl w:val="0"/>
-        </w:rPr>
-        <w:t xml:space="preserve">Uso de un determinado compilador o plataforma de desarrollo.</w:t>
-      </w:r>
-    </w:p>
-    <w:p>
-      <w:pPr>
-        <w:keepNext w:val="0"/>
-        <w:keepLines w:val="0"/>
-        <w:pageBreakBefore w:val="0"/>
-        <w:widowControl w:val="1"/>
-        <w:numPr>
-          <w:ilvl w:val="0"/>
-          <w:numId w:val="3"/>
-        </w:numPr>
-        <w:pBdr>
-          <w:top w:space="0" w:sz="0" w:val="nil"/>
-          <w:left w:space="0" w:sz="0" w:val="nil"/>
-          <w:bottom w:space="0" w:sz="0" w:val="nil"/>
-          <w:right w:space="0" w:sz="0" w:val="nil"/>
-          <w:between w:space="0" w:sz="0" w:val="nil"/>
-        </w:pBdr>
-        <w:shd w:fill="auto" w:val="clear"/>
-        <w:spacing w:after="200" w:before="0" w:line="276" w:lineRule="auto"/>
-        <w:ind w:left="720" w:right="0" w:hanging="360"/>
-        <w:jc w:val="both"/>
-        <w:rPr>
-          <w:b w:val="0"/>
-          <w:bCs w:val="0"/>
-          <w:i w:val="0"/>
-          <w:iCs w:val="0"/>
-          <w:smallCaps w:val="0"/>
-          <w:strike w:val="0"/>
-          <w:color w:val="ff0000"/>
-          <w:sz w:val="22"/>
-          <w:szCs w:val="22"/>
-          <w:shd w:fill="auto" w:val="clear"/>
-          <w:vertAlign w:val="baseline"/>
-        </w:rPr>
-      </w:pPr>
-      <w:r>
-        <w:rPr>
-          <w:rFonts w:ascii="Calibri" w:cs="Calibri" w:eastAsia="Calibri" w:hAnsi="Calibri"/>
-          <w:b w:val="0"/>
-          <w:bCs w:val="0"/>
-          <w:i w:val="0"/>
-          <w:iCs w:val="0"/>
-          <w:smallCaps w:val="0"/>
-          <w:strike w:val="0"/>
-          <w:color w:val="ff0000"/>
-          <w:sz w:val="22"/>
-          <w:szCs w:val="22"/>
-          <w:u w:val="none"/>
-          <w:shd w:fill="auto" w:val="clear"/>
-          <w:vertAlign w:val="baseline"/>
-          <w:rtl w:val="0"/>
-        </w:rPr>
         <w:t xml:space="preserve">Uso de un determinado sistema operativo.</w:t>
+      </w:r>
+      <w:r>
+        <w:rPr>
+          <w:rtl w:val="0"/>
+        </w:rPr>
       </w:r>
     </w:p>
     <w:p>
@@ -9042,7 +9564,6 @@
     <w:pPr>
       <w:keepNext w:val="0"/>
       <w:keepLines w:val="0"/>
-      <w:pageBreakBefore w:val="0"/>
       <w:widowControl w:val="1"/>
       <w:pBdr>
         <w:top w:space="0" w:sz="0" w:val="nil"/>
@@ -9106,7 +9627,6 @@
     <w:pPr>
       <w:keepNext w:val="0"/>
       <w:keepLines w:val="0"/>
-      <w:pageBreakBefore w:val="0"/>
       <w:widowControl w:val="1"/>
       <w:pBdr>
         <w:top w:space="0" w:sz="0" w:val="nil"/>
@@ -9154,7 +9674,6 @@
     <w:pPr>
       <w:keepNext w:val="0"/>
       <w:keepLines w:val="0"/>
-      <w:pageBreakBefore w:val="0"/>
       <w:widowControl w:val="1"/>
       <w:pBdr>
         <w:top w:space="0" w:sz="0" w:val="nil"/>
@@ -9211,7 +9730,6 @@
     <w:pPr>
       <w:keepNext w:val="0"/>
       <w:keepLines w:val="0"/>
-      <w:pageBreakBefore w:val="0"/>
       <w:widowControl w:val="1"/>
       <w:pBdr>
         <w:top w:space="0" w:sz="0" w:val="nil"/>
@@ -9257,12 +9775,12 @@
             <wp:posOffset>131977</wp:posOffset>
           </wp:positionH>
           <wp:positionV relativeFrom="paragraph">
-            <wp:posOffset>-152560</wp:posOffset>
+            <wp:posOffset>-152559</wp:posOffset>
           </wp:positionV>
           <wp:extent cx="932815" cy="231775"/>
           <wp:effectExtent b="0" l="0" r="0" t="0"/>
           <wp:wrapSquare wrapText="bothSides" distB="0" distT="0" distL="114300" distR="114300"/>
-          <wp:docPr id="3" name="image1.png"/>
+          <wp:docPr id="4" name="image1.png"/>
           <a:graphic>
             <a:graphicData uri="http://schemas.openxmlformats.org/drawingml/2006/picture">
               <pic:pic>
@@ -9296,7 +9814,6 @@
     <w:pPr>
       <w:keepNext w:val="0"/>
       <w:keepLines w:val="0"/>
-      <w:pageBreakBefore w:val="0"/>
       <w:widowControl w:val="1"/>
       <w:pBdr>
         <w:top w:space="0" w:sz="0" w:val="nil"/>
@@ -9343,6 +9860,336 @@
   <w:abstractNum w:abstractNumId="1">
     <w:lvl w:ilvl="0">
       <w:start w:val="1"/>
+      <w:numFmt w:val="bullet"/>
+      <w:lvlText w:val="●"/>
+      <w:lvlJc w:val="left"/>
+      <w:pPr>
+        <w:ind w:left="720" w:hanging="360"/>
+      </w:pPr>
+      <w:rPr>
+        <w:u w:val="none"/>
+      </w:rPr>
+    </w:lvl>
+    <w:lvl w:ilvl="1">
+      <w:start w:val="1"/>
+      <w:numFmt w:val="bullet"/>
+      <w:lvlText w:val="○"/>
+      <w:lvlJc w:val="left"/>
+      <w:pPr>
+        <w:ind w:left="1440" w:hanging="360"/>
+      </w:pPr>
+      <w:rPr>
+        <w:u w:val="none"/>
+      </w:rPr>
+    </w:lvl>
+    <w:lvl w:ilvl="2">
+      <w:start w:val="1"/>
+      <w:numFmt w:val="bullet"/>
+      <w:lvlText w:val="■"/>
+      <w:lvlJc w:val="left"/>
+      <w:pPr>
+        <w:ind w:left="2160" w:hanging="360"/>
+      </w:pPr>
+      <w:rPr>
+        <w:u w:val="none"/>
+      </w:rPr>
+    </w:lvl>
+    <w:lvl w:ilvl="3">
+      <w:start w:val="1"/>
+      <w:numFmt w:val="bullet"/>
+      <w:lvlText w:val="●"/>
+      <w:lvlJc w:val="left"/>
+      <w:pPr>
+        <w:ind w:left="2880" w:hanging="360"/>
+      </w:pPr>
+      <w:rPr>
+        <w:u w:val="none"/>
+      </w:rPr>
+    </w:lvl>
+    <w:lvl w:ilvl="4">
+      <w:start w:val="1"/>
+      <w:numFmt w:val="bullet"/>
+      <w:lvlText w:val="○"/>
+      <w:lvlJc w:val="left"/>
+      <w:pPr>
+        <w:ind w:left="3600" w:hanging="360"/>
+      </w:pPr>
+      <w:rPr>
+        <w:u w:val="none"/>
+      </w:rPr>
+    </w:lvl>
+    <w:lvl w:ilvl="5">
+      <w:start w:val="1"/>
+      <w:numFmt w:val="bullet"/>
+      <w:lvlText w:val="■"/>
+      <w:lvlJc w:val="left"/>
+      <w:pPr>
+        <w:ind w:left="4320" w:hanging="360"/>
+      </w:pPr>
+      <w:rPr>
+        <w:u w:val="none"/>
+      </w:rPr>
+    </w:lvl>
+    <w:lvl w:ilvl="6">
+      <w:start w:val="1"/>
+      <w:numFmt w:val="bullet"/>
+      <w:lvlText w:val="●"/>
+      <w:lvlJc w:val="left"/>
+      <w:pPr>
+        <w:ind w:left="5040" w:hanging="360"/>
+      </w:pPr>
+      <w:rPr>
+        <w:u w:val="none"/>
+      </w:rPr>
+    </w:lvl>
+    <w:lvl w:ilvl="7">
+      <w:start w:val="1"/>
+      <w:numFmt w:val="bullet"/>
+      <w:lvlText w:val="○"/>
+      <w:lvlJc w:val="left"/>
+      <w:pPr>
+        <w:ind w:left="5760" w:hanging="360"/>
+      </w:pPr>
+      <w:rPr>
+        <w:u w:val="none"/>
+      </w:rPr>
+    </w:lvl>
+    <w:lvl w:ilvl="8">
+      <w:start w:val="1"/>
+      <w:numFmt w:val="bullet"/>
+      <w:lvlText w:val="■"/>
+      <w:lvlJc w:val="left"/>
+      <w:pPr>
+        <w:ind w:left="6480" w:hanging="360"/>
+      </w:pPr>
+      <w:rPr>
+        <w:u w:val="none"/>
+      </w:rPr>
+    </w:lvl>
+  </w:abstractNum>
+  <w:abstractNum w:abstractNumId="2">
+    <w:lvl w:ilvl="0">
+      <w:start w:val="1"/>
+      <w:numFmt w:val="bullet"/>
+      <w:lvlText w:val="●"/>
+      <w:lvlJc w:val="left"/>
+      <w:pPr>
+        <w:ind w:left="720" w:hanging="360"/>
+      </w:pPr>
+      <w:rPr>
+        <w:u w:val="none"/>
+      </w:rPr>
+    </w:lvl>
+    <w:lvl w:ilvl="1">
+      <w:start w:val="1"/>
+      <w:numFmt w:val="bullet"/>
+      <w:lvlText w:val="○"/>
+      <w:lvlJc w:val="left"/>
+      <w:pPr>
+        <w:ind w:left="1440" w:hanging="360"/>
+      </w:pPr>
+      <w:rPr>
+        <w:u w:val="none"/>
+      </w:rPr>
+    </w:lvl>
+    <w:lvl w:ilvl="2">
+      <w:start w:val="1"/>
+      <w:numFmt w:val="bullet"/>
+      <w:lvlText w:val="■"/>
+      <w:lvlJc w:val="left"/>
+      <w:pPr>
+        <w:ind w:left="2160" w:hanging="360"/>
+      </w:pPr>
+      <w:rPr>
+        <w:u w:val="none"/>
+      </w:rPr>
+    </w:lvl>
+    <w:lvl w:ilvl="3">
+      <w:start w:val="1"/>
+      <w:numFmt w:val="bullet"/>
+      <w:lvlText w:val="●"/>
+      <w:lvlJc w:val="left"/>
+      <w:pPr>
+        <w:ind w:left="2880" w:hanging="360"/>
+      </w:pPr>
+      <w:rPr>
+        <w:u w:val="none"/>
+      </w:rPr>
+    </w:lvl>
+    <w:lvl w:ilvl="4">
+      <w:start w:val="1"/>
+      <w:numFmt w:val="bullet"/>
+      <w:lvlText w:val="○"/>
+      <w:lvlJc w:val="left"/>
+      <w:pPr>
+        <w:ind w:left="3600" w:hanging="360"/>
+      </w:pPr>
+      <w:rPr>
+        <w:u w:val="none"/>
+      </w:rPr>
+    </w:lvl>
+    <w:lvl w:ilvl="5">
+      <w:start w:val="1"/>
+      <w:numFmt w:val="bullet"/>
+      <w:lvlText w:val="■"/>
+      <w:lvlJc w:val="left"/>
+      <w:pPr>
+        <w:ind w:left="4320" w:hanging="360"/>
+      </w:pPr>
+      <w:rPr>
+        <w:u w:val="none"/>
+      </w:rPr>
+    </w:lvl>
+    <w:lvl w:ilvl="6">
+      <w:start w:val="1"/>
+      <w:numFmt w:val="bullet"/>
+      <w:lvlText w:val="●"/>
+      <w:lvlJc w:val="left"/>
+      <w:pPr>
+        <w:ind w:left="5040" w:hanging="360"/>
+      </w:pPr>
+      <w:rPr>
+        <w:u w:val="none"/>
+      </w:rPr>
+    </w:lvl>
+    <w:lvl w:ilvl="7">
+      <w:start w:val="1"/>
+      <w:numFmt w:val="bullet"/>
+      <w:lvlText w:val="○"/>
+      <w:lvlJc w:val="left"/>
+      <w:pPr>
+        <w:ind w:left="5760" w:hanging="360"/>
+      </w:pPr>
+      <w:rPr>
+        <w:u w:val="none"/>
+      </w:rPr>
+    </w:lvl>
+    <w:lvl w:ilvl="8">
+      <w:start w:val="1"/>
+      <w:numFmt w:val="bullet"/>
+      <w:lvlText w:val="■"/>
+      <w:lvlJc w:val="left"/>
+      <w:pPr>
+        <w:ind w:left="6480" w:hanging="360"/>
+      </w:pPr>
+      <w:rPr>
+        <w:u w:val="none"/>
+      </w:rPr>
+    </w:lvl>
+  </w:abstractNum>
+  <w:abstractNum w:abstractNumId="3">
+    <w:lvl w:ilvl="0">
+      <w:start w:val="1"/>
+      <w:numFmt w:val="bullet"/>
+      <w:lvlText w:val="●"/>
+      <w:lvlJc w:val="left"/>
+      <w:pPr>
+        <w:ind w:left="720" w:hanging="360"/>
+      </w:pPr>
+      <w:rPr>
+        <w:u w:val="none"/>
+      </w:rPr>
+    </w:lvl>
+    <w:lvl w:ilvl="1">
+      <w:start w:val="1"/>
+      <w:numFmt w:val="bullet"/>
+      <w:lvlText w:val="○"/>
+      <w:lvlJc w:val="left"/>
+      <w:pPr>
+        <w:ind w:left="1440" w:hanging="360"/>
+      </w:pPr>
+      <w:rPr>
+        <w:u w:val="none"/>
+      </w:rPr>
+    </w:lvl>
+    <w:lvl w:ilvl="2">
+      <w:start w:val="1"/>
+      <w:numFmt w:val="bullet"/>
+      <w:lvlText w:val="■"/>
+      <w:lvlJc w:val="left"/>
+      <w:pPr>
+        <w:ind w:left="2160" w:hanging="360"/>
+      </w:pPr>
+      <w:rPr>
+        <w:u w:val="none"/>
+      </w:rPr>
+    </w:lvl>
+    <w:lvl w:ilvl="3">
+      <w:start w:val="1"/>
+      <w:numFmt w:val="bullet"/>
+      <w:lvlText w:val="●"/>
+      <w:lvlJc w:val="left"/>
+      <w:pPr>
+        <w:ind w:left="2880" w:hanging="360"/>
+      </w:pPr>
+      <w:rPr>
+        <w:u w:val="none"/>
+      </w:rPr>
+    </w:lvl>
+    <w:lvl w:ilvl="4">
+      <w:start w:val="1"/>
+      <w:numFmt w:val="bullet"/>
+      <w:lvlText w:val="○"/>
+      <w:lvlJc w:val="left"/>
+      <w:pPr>
+        <w:ind w:left="3600" w:hanging="360"/>
+      </w:pPr>
+      <w:rPr>
+        <w:u w:val="none"/>
+      </w:rPr>
+    </w:lvl>
+    <w:lvl w:ilvl="5">
+      <w:start w:val="1"/>
+      <w:numFmt w:val="bullet"/>
+      <w:lvlText w:val="■"/>
+      <w:lvlJc w:val="left"/>
+      <w:pPr>
+        <w:ind w:left="4320" w:hanging="360"/>
+      </w:pPr>
+      <w:rPr>
+        <w:u w:val="none"/>
+      </w:rPr>
+    </w:lvl>
+    <w:lvl w:ilvl="6">
+      <w:start w:val="1"/>
+      <w:numFmt w:val="bullet"/>
+      <w:lvlText w:val="●"/>
+      <w:lvlJc w:val="left"/>
+      <w:pPr>
+        <w:ind w:left="5040" w:hanging="360"/>
+      </w:pPr>
+      <w:rPr>
+        <w:u w:val="none"/>
+      </w:rPr>
+    </w:lvl>
+    <w:lvl w:ilvl="7">
+      <w:start w:val="1"/>
+      <w:numFmt w:val="bullet"/>
+      <w:lvlText w:val="○"/>
+      <w:lvlJc w:val="left"/>
+      <w:pPr>
+        <w:ind w:left="5760" w:hanging="360"/>
+      </w:pPr>
+      <w:rPr>
+        <w:u w:val="none"/>
+      </w:rPr>
+    </w:lvl>
+    <w:lvl w:ilvl="8">
+      <w:start w:val="1"/>
+      <w:numFmt w:val="bullet"/>
+      <w:lvlText w:val="■"/>
+      <w:lvlJc w:val="left"/>
+      <w:pPr>
+        <w:ind w:left="6480" w:hanging="360"/>
+      </w:pPr>
+      <w:rPr>
+        <w:u w:val="none"/>
+      </w:rPr>
+    </w:lvl>
+  </w:abstractNum>
+  <w:abstractNum w:abstractNumId="4">
+    <w:lvl w:ilvl="0">
+      <w:start w:val="1"/>
       <w:numFmt w:val="decimal"/>
       <w:lvlText w:val="%1."/>
       <w:lvlJc w:val="left"/>
@@ -9450,7 +10297,7 @@
       </w:rPr>
     </w:lvl>
   </w:abstractNum>
-  <w:abstractNum w:abstractNumId="2">
+  <w:abstractNum w:abstractNumId="5">
     <w:lvl w:ilvl="0">
       <w:start w:val="1"/>
       <w:numFmt w:val="decimal"/>
@@ -9557,336 +10404,6 @@
       </w:pPr>
       <w:rPr>
         <w:u w:val="none"/>
-      </w:rPr>
-    </w:lvl>
-  </w:abstractNum>
-  <w:abstractNum w:abstractNumId="3">
-    <w:lvl w:ilvl="0">
-      <w:start w:val="1"/>
-      <w:numFmt w:val="bullet"/>
-      <w:lvlText w:val="−"/>
-      <w:lvlJc w:val="left"/>
-      <w:pPr>
-        <w:ind w:left="720" w:hanging="360"/>
-      </w:pPr>
-      <w:rPr>
-        <w:rFonts w:ascii="Noto Sans Symbols" w:cs="Noto Sans Symbols" w:eastAsia="Noto Sans Symbols" w:hAnsi="Noto Sans Symbols"/>
-      </w:rPr>
-    </w:lvl>
-    <w:lvl w:ilvl="1">
-      <w:start w:val="1"/>
-      <w:numFmt w:val="bullet"/>
-      <w:lvlText w:val="o"/>
-      <w:lvlJc w:val="left"/>
-      <w:pPr>
-        <w:ind w:left="1440" w:hanging="360"/>
-      </w:pPr>
-      <w:rPr>
-        <w:rFonts w:ascii="Courier New" w:cs="Courier New" w:eastAsia="Courier New" w:hAnsi="Courier New"/>
-      </w:rPr>
-    </w:lvl>
-    <w:lvl w:ilvl="2">
-      <w:start w:val="1"/>
-      <w:numFmt w:val="bullet"/>
-      <w:lvlText w:val="▪"/>
-      <w:lvlJc w:val="left"/>
-      <w:pPr>
-        <w:ind w:left="2160" w:hanging="360"/>
-      </w:pPr>
-      <w:rPr>
-        <w:rFonts w:ascii="Noto Sans Symbols" w:cs="Noto Sans Symbols" w:eastAsia="Noto Sans Symbols" w:hAnsi="Noto Sans Symbols"/>
-      </w:rPr>
-    </w:lvl>
-    <w:lvl w:ilvl="3">
-      <w:start w:val="1"/>
-      <w:numFmt w:val="bullet"/>
-      <w:lvlText w:val="●"/>
-      <w:lvlJc w:val="left"/>
-      <w:pPr>
-        <w:ind w:left="2880" w:hanging="360"/>
-      </w:pPr>
-      <w:rPr>
-        <w:rFonts w:ascii="Noto Sans Symbols" w:cs="Noto Sans Symbols" w:eastAsia="Noto Sans Symbols" w:hAnsi="Noto Sans Symbols"/>
-      </w:rPr>
-    </w:lvl>
-    <w:lvl w:ilvl="4">
-      <w:start w:val="1"/>
-      <w:numFmt w:val="bullet"/>
-      <w:lvlText w:val="o"/>
-      <w:lvlJc w:val="left"/>
-      <w:pPr>
-        <w:ind w:left="3600" w:hanging="360"/>
-      </w:pPr>
-      <w:rPr>
-        <w:rFonts w:ascii="Courier New" w:cs="Courier New" w:eastAsia="Courier New" w:hAnsi="Courier New"/>
-      </w:rPr>
-    </w:lvl>
-    <w:lvl w:ilvl="5">
-      <w:start w:val="1"/>
-      <w:numFmt w:val="bullet"/>
-      <w:lvlText w:val="▪"/>
-      <w:lvlJc w:val="left"/>
-      <w:pPr>
-        <w:ind w:left="4320" w:hanging="360"/>
-      </w:pPr>
-      <w:rPr>
-        <w:rFonts w:ascii="Noto Sans Symbols" w:cs="Noto Sans Symbols" w:eastAsia="Noto Sans Symbols" w:hAnsi="Noto Sans Symbols"/>
-      </w:rPr>
-    </w:lvl>
-    <w:lvl w:ilvl="6">
-      <w:start w:val="1"/>
-      <w:numFmt w:val="bullet"/>
-      <w:lvlText w:val="●"/>
-      <w:lvlJc w:val="left"/>
-      <w:pPr>
-        <w:ind w:left="5040" w:hanging="360"/>
-      </w:pPr>
-      <w:rPr>
-        <w:rFonts w:ascii="Noto Sans Symbols" w:cs="Noto Sans Symbols" w:eastAsia="Noto Sans Symbols" w:hAnsi="Noto Sans Symbols"/>
-      </w:rPr>
-    </w:lvl>
-    <w:lvl w:ilvl="7">
-      <w:start w:val="1"/>
-      <w:numFmt w:val="bullet"/>
-      <w:lvlText w:val="o"/>
-      <w:lvlJc w:val="left"/>
-      <w:pPr>
-        <w:ind w:left="5760" w:hanging="360"/>
-      </w:pPr>
-      <w:rPr>
-        <w:rFonts w:ascii="Courier New" w:cs="Courier New" w:eastAsia="Courier New" w:hAnsi="Courier New"/>
-      </w:rPr>
-    </w:lvl>
-    <w:lvl w:ilvl="8">
-      <w:start w:val="1"/>
-      <w:numFmt w:val="bullet"/>
-      <w:lvlText w:val="▪"/>
-      <w:lvlJc w:val="left"/>
-      <w:pPr>
-        <w:ind w:left="6480" w:hanging="360"/>
-      </w:pPr>
-      <w:rPr>
-        <w:rFonts w:ascii="Noto Sans Symbols" w:cs="Noto Sans Symbols" w:eastAsia="Noto Sans Symbols" w:hAnsi="Noto Sans Symbols"/>
-      </w:rPr>
-    </w:lvl>
-  </w:abstractNum>
-  <w:abstractNum w:abstractNumId="4">
-    <w:lvl w:ilvl="0">
-      <w:start w:val="1"/>
-      <w:numFmt w:val="bullet"/>
-      <w:lvlText w:val="−"/>
-      <w:lvlJc w:val="left"/>
-      <w:pPr>
-        <w:ind w:left="720" w:hanging="360"/>
-      </w:pPr>
-      <w:rPr>
-        <w:rFonts w:ascii="Noto Sans Symbols" w:cs="Noto Sans Symbols" w:eastAsia="Noto Sans Symbols" w:hAnsi="Noto Sans Symbols"/>
-      </w:rPr>
-    </w:lvl>
-    <w:lvl w:ilvl="1">
-      <w:start w:val="1"/>
-      <w:numFmt w:val="bullet"/>
-      <w:lvlText w:val="o"/>
-      <w:lvlJc w:val="left"/>
-      <w:pPr>
-        <w:ind w:left="1440" w:hanging="360"/>
-      </w:pPr>
-      <w:rPr>
-        <w:rFonts w:ascii="Courier New" w:cs="Courier New" w:eastAsia="Courier New" w:hAnsi="Courier New"/>
-      </w:rPr>
-    </w:lvl>
-    <w:lvl w:ilvl="2">
-      <w:start w:val="1"/>
-      <w:numFmt w:val="bullet"/>
-      <w:lvlText w:val="▪"/>
-      <w:lvlJc w:val="left"/>
-      <w:pPr>
-        <w:ind w:left="2160" w:hanging="360"/>
-      </w:pPr>
-      <w:rPr>
-        <w:rFonts w:ascii="Noto Sans Symbols" w:cs="Noto Sans Symbols" w:eastAsia="Noto Sans Symbols" w:hAnsi="Noto Sans Symbols"/>
-      </w:rPr>
-    </w:lvl>
-    <w:lvl w:ilvl="3">
-      <w:start w:val="1"/>
-      <w:numFmt w:val="bullet"/>
-      <w:lvlText w:val="●"/>
-      <w:lvlJc w:val="left"/>
-      <w:pPr>
-        <w:ind w:left="2880" w:hanging="360"/>
-      </w:pPr>
-      <w:rPr>
-        <w:rFonts w:ascii="Noto Sans Symbols" w:cs="Noto Sans Symbols" w:eastAsia="Noto Sans Symbols" w:hAnsi="Noto Sans Symbols"/>
-      </w:rPr>
-    </w:lvl>
-    <w:lvl w:ilvl="4">
-      <w:start w:val="1"/>
-      <w:numFmt w:val="bullet"/>
-      <w:lvlText w:val="o"/>
-      <w:lvlJc w:val="left"/>
-      <w:pPr>
-        <w:ind w:left="3600" w:hanging="360"/>
-      </w:pPr>
-      <w:rPr>
-        <w:rFonts w:ascii="Courier New" w:cs="Courier New" w:eastAsia="Courier New" w:hAnsi="Courier New"/>
-      </w:rPr>
-    </w:lvl>
-    <w:lvl w:ilvl="5">
-      <w:start w:val="1"/>
-      <w:numFmt w:val="bullet"/>
-      <w:lvlText w:val="▪"/>
-      <w:lvlJc w:val="left"/>
-      <w:pPr>
-        <w:ind w:left="4320" w:hanging="360"/>
-      </w:pPr>
-      <w:rPr>
-        <w:rFonts w:ascii="Noto Sans Symbols" w:cs="Noto Sans Symbols" w:eastAsia="Noto Sans Symbols" w:hAnsi="Noto Sans Symbols"/>
-      </w:rPr>
-    </w:lvl>
-    <w:lvl w:ilvl="6">
-      <w:start w:val="1"/>
-      <w:numFmt w:val="bullet"/>
-      <w:lvlText w:val="●"/>
-      <w:lvlJc w:val="left"/>
-      <w:pPr>
-        <w:ind w:left="5040" w:hanging="360"/>
-      </w:pPr>
-      <w:rPr>
-        <w:rFonts w:ascii="Noto Sans Symbols" w:cs="Noto Sans Symbols" w:eastAsia="Noto Sans Symbols" w:hAnsi="Noto Sans Symbols"/>
-      </w:rPr>
-    </w:lvl>
-    <w:lvl w:ilvl="7">
-      <w:start w:val="1"/>
-      <w:numFmt w:val="bullet"/>
-      <w:lvlText w:val="o"/>
-      <w:lvlJc w:val="left"/>
-      <w:pPr>
-        <w:ind w:left="5760" w:hanging="360"/>
-      </w:pPr>
-      <w:rPr>
-        <w:rFonts w:ascii="Courier New" w:cs="Courier New" w:eastAsia="Courier New" w:hAnsi="Courier New"/>
-      </w:rPr>
-    </w:lvl>
-    <w:lvl w:ilvl="8">
-      <w:start w:val="1"/>
-      <w:numFmt w:val="bullet"/>
-      <w:lvlText w:val="▪"/>
-      <w:lvlJc w:val="left"/>
-      <w:pPr>
-        <w:ind w:left="6480" w:hanging="360"/>
-      </w:pPr>
-      <w:rPr>
-        <w:rFonts w:ascii="Noto Sans Symbols" w:cs="Noto Sans Symbols" w:eastAsia="Noto Sans Symbols" w:hAnsi="Noto Sans Symbols"/>
-      </w:rPr>
-    </w:lvl>
-  </w:abstractNum>
-  <w:abstractNum w:abstractNumId="5">
-    <w:lvl w:ilvl="0">
-      <w:start w:val="1"/>
-      <w:numFmt w:val="bullet"/>
-      <w:lvlText w:val="−"/>
-      <w:lvlJc w:val="left"/>
-      <w:pPr>
-        <w:ind w:left="720" w:hanging="360"/>
-      </w:pPr>
-      <w:rPr>
-        <w:rFonts w:ascii="Noto Sans Symbols" w:cs="Noto Sans Symbols" w:eastAsia="Noto Sans Symbols" w:hAnsi="Noto Sans Symbols"/>
-      </w:rPr>
-    </w:lvl>
-    <w:lvl w:ilvl="1">
-      <w:start w:val="1"/>
-      <w:numFmt w:val="bullet"/>
-      <w:lvlText w:val="o"/>
-      <w:lvlJc w:val="left"/>
-      <w:pPr>
-        <w:ind w:left="1440" w:hanging="360"/>
-      </w:pPr>
-      <w:rPr>
-        <w:rFonts w:ascii="Courier New" w:cs="Courier New" w:eastAsia="Courier New" w:hAnsi="Courier New"/>
-      </w:rPr>
-    </w:lvl>
-    <w:lvl w:ilvl="2">
-      <w:start w:val="1"/>
-      <w:numFmt w:val="bullet"/>
-      <w:lvlText w:val="▪"/>
-      <w:lvlJc w:val="left"/>
-      <w:pPr>
-        <w:ind w:left="2160" w:hanging="360"/>
-      </w:pPr>
-      <w:rPr>
-        <w:rFonts w:ascii="Noto Sans Symbols" w:cs="Noto Sans Symbols" w:eastAsia="Noto Sans Symbols" w:hAnsi="Noto Sans Symbols"/>
-      </w:rPr>
-    </w:lvl>
-    <w:lvl w:ilvl="3">
-      <w:start w:val="1"/>
-      <w:numFmt w:val="bullet"/>
-      <w:lvlText w:val="●"/>
-      <w:lvlJc w:val="left"/>
-      <w:pPr>
-        <w:ind w:left="2880" w:hanging="360"/>
-      </w:pPr>
-      <w:rPr>
-        <w:rFonts w:ascii="Noto Sans Symbols" w:cs="Noto Sans Symbols" w:eastAsia="Noto Sans Symbols" w:hAnsi="Noto Sans Symbols"/>
-      </w:rPr>
-    </w:lvl>
-    <w:lvl w:ilvl="4">
-      <w:start w:val="1"/>
-      <w:numFmt w:val="bullet"/>
-      <w:lvlText w:val="o"/>
-      <w:lvlJc w:val="left"/>
-      <w:pPr>
-        <w:ind w:left="3600" w:hanging="360"/>
-      </w:pPr>
-      <w:rPr>
-        <w:rFonts w:ascii="Courier New" w:cs="Courier New" w:eastAsia="Courier New" w:hAnsi="Courier New"/>
-      </w:rPr>
-    </w:lvl>
-    <w:lvl w:ilvl="5">
-      <w:start w:val="1"/>
-      <w:numFmt w:val="bullet"/>
-      <w:lvlText w:val="▪"/>
-      <w:lvlJc w:val="left"/>
-      <w:pPr>
-        <w:ind w:left="4320" w:hanging="360"/>
-      </w:pPr>
-      <w:rPr>
-        <w:rFonts w:ascii="Noto Sans Symbols" w:cs="Noto Sans Symbols" w:eastAsia="Noto Sans Symbols" w:hAnsi="Noto Sans Symbols"/>
-      </w:rPr>
-    </w:lvl>
-    <w:lvl w:ilvl="6">
-      <w:start w:val="1"/>
-      <w:numFmt w:val="bullet"/>
-      <w:lvlText w:val="●"/>
-      <w:lvlJc w:val="left"/>
-      <w:pPr>
-        <w:ind w:left="5040" w:hanging="360"/>
-      </w:pPr>
-      <w:rPr>
-        <w:rFonts w:ascii="Noto Sans Symbols" w:cs="Noto Sans Symbols" w:eastAsia="Noto Sans Symbols" w:hAnsi="Noto Sans Symbols"/>
-      </w:rPr>
-    </w:lvl>
-    <w:lvl w:ilvl="7">
-      <w:start w:val="1"/>
-      <w:numFmt w:val="bullet"/>
-      <w:lvlText w:val="o"/>
-      <w:lvlJc w:val="left"/>
-      <w:pPr>
-        <w:ind w:left="5760" w:hanging="360"/>
-      </w:pPr>
-      <w:rPr>
-        <w:rFonts w:ascii="Courier New" w:cs="Courier New" w:eastAsia="Courier New" w:hAnsi="Courier New"/>
-      </w:rPr>
-    </w:lvl>
-    <w:lvl w:ilvl="8">
-      <w:start w:val="1"/>
-      <w:numFmt w:val="bullet"/>
-      <w:lvlText w:val="▪"/>
-      <w:lvlJc w:val="left"/>
-      <w:pPr>
-        <w:ind w:left="6480" w:hanging="360"/>
-      </w:pPr>
-      <w:rPr>
-        <w:rFonts w:ascii="Noto Sans Symbols" w:cs="Noto Sans Symbols" w:eastAsia="Noto Sans Symbols" w:hAnsi="Noto Sans Symbols"/>
       </w:rPr>
     </w:lvl>
   </w:abstractNum>
@@ -10107,6 +10624,556 @@
       </w:pPr>
       <w:rPr>
         <w:rFonts w:ascii="Noto Sans Symbols" w:cs="Noto Sans Symbols" w:eastAsia="Noto Sans Symbols" w:hAnsi="Noto Sans Symbols"/>
+      </w:rPr>
+    </w:lvl>
+  </w:abstractNum>
+  <w:abstractNum w:abstractNumId="8">
+    <w:lvl w:ilvl="0">
+      <w:start w:val="1"/>
+      <w:numFmt w:val="bullet"/>
+      <w:lvlText w:val="−"/>
+      <w:lvlJc w:val="left"/>
+      <w:pPr>
+        <w:ind w:left="720" w:hanging="360"/>
+      </w:pPr>
+      <w:rPr>
+        <w:rFonts w:ascii="Noto Sans Symbols" w:cs="Noto Sans Symbols" w:eastAsia="Noto Sans Symbols" w:hAnsi="Noto Sans Symbols"/>
+      </w:rPr>
+    </w:lvl>
+    <w:lvl w:ilvl="1">
+      <w:start w:val="1"/>
+      <w:numFmt w:val="bullet"/>
+      <w:lvlText w:val="o"/>
+      <w:lvlJc w:val="left"/>
+      <w:pPr>
+        <w:ind w:left="1440" w:hanging="360"/>
+      </w:pPr>
+      <w:rPr>
+        <w:rFonts w:ascii="Courier New" w:cs="Courier New" w:eastAsia="Courier New" w:hAnsi="Courier New"/>
+      </w:rPr>
+    </w:lvl>
+    <w:lvl w:ilvl="2">
+      <w:start w:val="1"/>
+      <w:numFmt w:val="bullet"/>
+      <w:lvlText w:val="▪"/>
+      <w:lvlJc w:val="left"/>
+      <w:pPr>
+        <w:ind w:left="2160" w:hanging="360"/>
+      </w:pPr>
+      <w:rPr>
+        <w:rFonts w:ascii="Noto Sans Symbols" w:cs="Noto Sans Symbols" w:eastAsia="Noto Sans Symbols" w:hAnsi="Noto Sans Symbols"/>
+      </w:rPr>
+    </w:lvl>
+    <w:lvl w:ilvl="3">
+      <w:start w:val="1"/>
+      <w:numFmt w:val="bullet"/>
+      <w:lvlText w:val="●"/>
+      <w:lvlJc w:val="left"/>
+      <w:pPr>
+        <w:ind w:left="2880" w:hanging="360"/>
+      </w:pPr>
+      <w:rPr>
+        <w:rFonts w:ascii="Noto Sans Symbols" w:cs="Noto Sans Symbols" w:eastAsia="Noto Sans Symbols" w:hAnsi="Noto Sans Symbols"/>
+      </w:rPr>
+    </w:lvl>
+    <w:lvl w:ilvl="4">
+      <w:start w:val="1"/>
+      <w:numFmt w:val="bullet"/>
+      <w:lvlText w:val="o"/>
+      <w:lvlJc w:val="left"/>
+      <w:pPr>
+        <w:ind w:left="3600" w:hanging="360"/>
+      </w:pPr>
+      <w:rPr>
+        <w:rFonts w:ascii="Courier New" w:cs="Courier New" w:eastAsia="Courier New" w:hAnsi="Courier New"/>
+      </w:rPr>
+    </w:lvl>
+    <w:lvl w:ilvl="5">
+      <w:start w:val="1"/>
+      <w:numFmt w:val="bullet"/>
+      <w:lvlText w:val="▪"/>
+      <w:lvlJc w:val="left"/>
+      <w:pPr>
+        <w:ind w:left="4320" w:hanging="360"/>
+      </w:pPr>
+      <w:rPr>
+        <w:rFonts w:ascii="Noto Sans Symbols" w:cs="Noto Sans Symbols" w:eastAsia="Noto Sans Symbols" w:hAnsi="Noto Sans Symbols"/>
+      </w:rPr>
+    </w:lvl>
+    <w:lvl w:ilvl="6">
+      <w:start w:val="1"/>
+      <w:numFmt w:val="bullet"/>
+      <w:lvlText w:val="●"/>
+      <w:lvlJc w:val="left"/>
+      <w:pPr>
+        <w:ind w:left="5040" w:hanging="360"/>
+      </w:pPr>
+      <w:rPr>
+        <w:rFonts w:ascii="Noto Sans Symbols" w:cs="Noto Sans Symbols" w:eastAsia="Noto Sans Symbols" w:hAnsi="Noto Sans Symbols"/>
+      </w:rPr>
+    </w:lvl>
+    <w:lvl w:ilvl="7">
+      <w:start w:val="1"/>
+      <w:numFmt w:val="bullet"/>
+      <w:lvlText w:val="o"/>
+      <w:lvlJc w:val="left"/>
+      <w:pPr>
+        <w:ind w:left="5760" w:hanging="360"/>
+      </w:pPr>
+      <w:rPr>
+        <w:rFonts w:ascii="Courier New" w:cs="Courier New" w:eastAsia="Courier New" w:hAnsi="Courier New"/>
+      </w:rPr>
+    </w:lvl>
+    <w:lvl w:ilvl="8">
+      <w:start w:val="1"/>
+      <w:numFmt w:val="bullet"/>
+      <w:lvlText w:val="▪"/>
+      <w:lvlJc w:val="left"/>
+      <w:pPr>
+        <w:ind w:left="6480" w:hanging="360"/>
+      </w:pPr>
+      <w:rPr>
+        <w:rFonts w:ascii="Noto Sans Symbols" w:cs="Noto Sans Symbols" w:eastAsia="Noto Sans Symbols" w:hAnsi="Noto Sans Symbols"/>
+      </w:rPr>
+    </w:lvl>
+  </w:abstractNum>
+  <w:abstractNum w:abstractNumId="9">
+    <w:lvl w:ilvl="0">
+      <w:start w:val="1"/>
+      <w:numFmt w:val="bullet"/>
+      <w:lvlText w:val="−"/>
+      <w:lvlJc w:val="left"/>
+      <w:pPr>
+        <w:ind w:left="720" w:hanging="360"/>
+      </w:pPr>
+      <w:rPr>
+        <w:rFonts w:ascii="Noto Sans Symbols" w:cs="Noto Sans Symbols" w:eastAsia="Noto Sans Symbols" w:hAnsi="Noto Sans Symbols"/>
+      </w:rPr>
+    </w:lvl>
+    <w:lvl w:ilvl="1">
+      <w:start w:val="1"/>
+      <w:numFmt w:val="bullet"/>
+      <w:lvlText w:val="o"/>
+      <w:lvlJc w:val="left"/>
+      <w:pPr>
+        <w:ind w:left="1440" w:hanging="360"/>
+      </w:pPr>
+      <w:rPr>
+        <w:rFonts w:ascii="Courier New" w:cs="Courier New" w:eastAsia="Courier New" w:hAnsi="Courier New"/>
+      </w:rPr>
+    </w:lvl>
+    <w:lvl w:ilvl="2">
+      <w:start w:val="1"/>
+      <w:numFmt w:val="bullet"/>
+      <w:lvlText w:val="▪"/>
+      <w:lvlJc w:val="left"/>
+      <w:pPr>
+        <w:ind w:left="2160" w:hanging="360"/>
+      </w:pPr>
+      <w:rPr>
+        <w:rFonts w:ascii="Noto Sans Symbols" w:cs="Noto Sans Symbols" w:eastAsia="Noto Sans Symbols" w:hAnsi="Noto Sans Symbols"/>
+      </w:rPr>
+    </w:lvl>
+    <w:lvl w:ilvl="3">
+      <w:start w:val="1"/>
+      <w:numFmt w:val="bullet"/>
+      <w:lvlText w:val="●"/>
+      <w:lvlJc w:val="left"/>
+      <w:pPr>
+        <w:ind w:left="2880" w:hanging="360"/>
+      </w:pPr>
+      <w:rPr>
+        <w:rFonts w:ascii="Noto Sans Symbols" w:cs="Noto Sans Symbols" w:eastAsia="Noto Sans Symbols" w:hAnsi="Noto Sans Symbols"/>
+      </w:rPr>
+    </w:lvl>
+    <w:lvl w:ilvl="4">
+      <w:start w:val="1"/>
+      <w:numFmt w:val="bullet"/>
+      <w:lvlText w:val="o"/>
+      <w:lvlJc w:val="left"/>
+      <w:pPr>
+        <w:ind w:left="3600" w:hanging="360"/>
+      </w:pPr>
+      <w:rPr>
+        <w:rFonts w:ascii="Courier New" w:cs="Courier New" w:eastAsia="Courier New" w:hAnsi="Courier New"/>
+      </w:rPr>
+    </w:lvl>
+    <w:lvl w:ilvl="5">
+      <w:start w:val="1"/>
+      <w:numFmt w:val="bullet"/>
+      <w:lvlText w:val="▪"/>
+      <w:lvlJc w:val="left"/>
+      <w:pPr>
+        <w:ind w:left="4320" w:hanging="360"/>
+      </w:pPr>
+      <w:rPr>
+        <w:rFonts w:ascii="Noto Sans Symbols" w:cs="Noto Sans Symbols" w:eastAsia="Noto Sans Symbols" w:hAnsi="Noto Sans Symbols"/>
+      </w:rPr>
+    </w:lvl>
+    <w:lvl w:ilvl="6">
+      <w:start w:val="1"/>
+      <w:numFmt w:val="bullet"/>
+      <w:lvlText w:val="●"/>
+      <w:lvlJc w:val="left"/>
+      <w:pPr>
+        <w:ind w:left="5040" w:hanging="360"/>
+      </w:pPr>
+      <w:rPr>
+        <w:rFonts w:ascii="Noto Sans Symbols" w:cs="Noto Sans Symbols" w:eastAsia="Noto Sans Symbols" w:hAnsi="Noto Sans Symbols"/>
+      </w:rPr>
+    </w:lvl>
+    <w:lvl w:ilvl="7">
+      <w:start w:val="1"/>
+      <w:numFmt w:val="bullet"/>
+      <w:lvlText w:val="o"/>
+      <w:lvlJc w:val="left"/>
+      <w:pPr>
+        <w:ind w:left="5760" w:hanging="360"/>
+      </w:pPr>
+      <w:rPr>
+        <w:rFonts w:ascii="Courier New" w:cs="Courier New" w:eastAsia="Courier New" w:hAnsi="Courier New"/>
+      </w:rPr>
+    </w:lvl>
+    <w:lvl w:ilvl="8">
+      <w:start w:val="1"/>
+      <w:numFmt w:val="bullet"/>
+      <w:lvlText w:val="▪"/>
+      <w:lvlJc w:val="left"/>
+      <w:pPr>
+        <w:ind w:left="6480" w:hanging="360"/>
+      </w:pPr>
+      <w:rPr>
+        <w:rFonts w:ascii="Noto Sans Symbols" w:cs="Noto Sans Symbols" w:eastAsia="Noto Sans Symbols" w:hAnsi="Noto Sans Symbols"/>
+      </w:rPr>
+    </w:lvl>
+  </w:abstractNum>
+  <w:abstractNum w:abstractNumId="10">
+    <w:lvl w:ilvl="0">
+      <w:start w:val="1"/>
+      <w:numFmt w:val="bullet"/>
+      <w:lvlText w:val="−"/>
+      <w:lvlJc w:val="left"/>
+      <w:pPr>
+        <w:ind w:left="720" w:hanging="360"/>
+      </w:pPr>
+      <w:rPr>
+        <w:rFonts w:ascii="Noto Sans Symbols" w:cs="Noto Sans Symbols" w:eastAsia="Noto Sans Symbols" w:hAnsi="Noto Sans Symbols"/>
+      </w:rPr>
+    </w:lvl>
+    <w:lvl w:ilvl="1">
+      <w:start w:val="1"/>
+      <w:numFmt w:val="bullet"/>
+      <w:lvlText w:val="o"/>
+      <w:lvlJc w:val="left"/>
+      <w:pPr>
+        <w:ind w:left="1440" w:hanging="360"/>
+      </w:pPr>
+      <w:rPr>
+        <w:rFonts w:ascii="Courier New" w:cs="Courier New" w:eastAsia="Courier New" w:hAnsi="Courier New"/>
+      </w:rPr>
+    </w:lvl>
+    <w:lvl w:ilvl="2">
+      <w:start w:val="1"/>
+      <w:numFmt w:val="bullet"/>
+      <w:lvlText w:val="▪"/>
+      <w:lvlJc w:val="left"/>
+      <w:pPr>
+        <w:ind w:left="2160" w:hanging="360"/>
+      </w:pPr>
+      <w:rPr>
+        <w:rFonts w:ascii="Noto Sans Symbols" w:cs="Noto Sans Symbols" w:eastAsia="Noto Sans Symbols" w:hAnsi="Noto Sans Symbols"/>
+      </w:rPr>
+    </w:lvl>
+    <w:lvl w:ilvl="3">
+      <w:start w:val="1"/>
+      <w:numFmt w:val="bullet"/>
+      <w:lvlText w:val="●"/>
+      <w:lvlJc w:val="left"/>
+      <w:pPr>
+        <w:ind w:left="2880" w:hanging="360"/>
+      </w:pPr>
+      <w:rPr>
+        <w:rFonts w:ascii="Noto Sans Symbols" w:cs="Noto Sans Symbols" w:eastAsia="Noto Sans Symbols" w:hAnsi="Noto Sans Symbols"/>
+      </w:rPr>
+    </w:lvl>
+    <w:lvl w:ilvl="4">
+      <w:start w:val="1"/>
+      <w:numFmt w:val="bullet"/>
+      <w:lvlText w:val="o"/>
+      <w:lvlJc w:val="left"/>
+      <w:pPr>
+        <w:ind w:left="3600" w:hanging="360"/>
+      </w:pPr>
+      <w:rPr>
+        <w:rFonts w:ascii="Courier New" w:cs="Courier New" w:eastAsia="Courier New" w:hAnsi="Courier New"/>
+      </w:rPr>
+    </w:lvl>
+    <w:lvl w:ilvl="5">
+      <w:start w:val="1"/>
+      <w:numFmt w:val="bullet"/>
+      <w:lvlText w:val="▪"/>
+      <w:lvlJc w:val="left"/>
+      <w:pPr>
+        <w:ind w:left="4320" w:hanging="360"/>
+      </w:pPr>
+      <w:rPr>
+        <w:rFonts w:ascii="Noto Sans Symbols" w:cs="Noto Sans Symbols" w:eastAsia="Noto Sans Symbols" w:hAnsi="Noto Sans Symbols"/>
+      </w:rPr>
+    </w:lvl>
+    <w:lvl w:ilvl="6">
+      <w:start w:val="1"/>
+      <w:numFmt w:val="bullet"/>
+      <w:lvlText w:val="●"/>
+      <w:lvlJc w:val="left"/>
+      <w:pPr>
+        <w:ind w:left="5040" w:hanging="360"/>
+      </w:pPr>
+      <w:rPr>
+        <w:rFonts w:ascii="Noto Sans Symbols" w:cs="Noto Sans Symbols" w:eastAsia="Noto Sans Symbols" w:hAnsi="Noto Sans Symbols"/>
+      </w:rPr>
+    </w:lvl>
+    <w:lvl w:ilvl="7">
+      <w:start w:val="1"/>
+      <w:numFmt w:val="bullet"/>
+      <w:lvlText w:val="o"/>
+      <w:lvlJc w:val="left"/>
+      <w:pPr>
+        <w:ind w:left="5760" w:hanging="360"/>
+      </w:pPr>
+      <w:rPr>
+        <w:rFonts w:ascii="Courier New" w:cs="Courier New" w:eastAsia="Courier New" w:hAnsi="Courier New"/>
+      </w:rPr>
+    </w:lvl>
+    <w:lvl w:ilvl="8">
+      <w:start w:val="1"/>
+      <w:numFmt w:val="bullet"/>
+      <w:lvlText w:val="▪"/>
+      <w:lvlJc w:val="left"/>
+      <w:pPr>
+        <w:ind w:left="6480" w:hanging="360"/>
+      </w:pPr>
+      <w:rPr>
+        <w:rFonts w:ascii="Noto Sans Symbols" w:cs="Noto Sans Symbols" w:eastAsia="Noto Sans Symbols" w:hAnsi="Noto Sans Symbols"/>
+      </w:rPr>
+    </w:lvl>
+  </w:abstractNum>
+  <w:abstractNum w:abstractNumId="11">
+    <w:lvl w:ilvl="0">
+      <w:start w:val="1"/>
+      <w:numFmt w:val="bullet"/>
+      <w:lvlText w:val="●"/>
+      <w:lvlJc w:val="left"/>
+      <w:pPr>
+        <w:ind w:left="720" w:hanging="360"/>
+      </w:pPr>
+      <w:rPr>
+        <w:u w:val="none"/>
+      </w:rPr>
+    </w:lvl>
+    <w:lvl w:ilvl="1">
+      <w:start w:val="1"/>
+      <w:numFmt w:val="bullet"/>
+      <w:lvlText w:val="○"/>
+      <w:lvlJc w:val="left"/>
+      <w:pPr>
+        <w:ind w:left="1440" w:hanging="360"/>
+      </w:pPr>
+      <w:rPr>
+        <w:u w:val="none"/>
+      </w:rPr>
+    </w:lvl>
+    <w:lvl w:ilvl="2">
+      <w:start w:val="1"/>
+      <w:numFmt w:val="bullet"/>
+      <w:lvlText w:val="■"/>
+      <w:lvlJc w:val="left"/>
+      <w:pPr>
+        <w:ind w:left="2160" w:hanging="360"/>
+      </w:pPr>
+      <w:rPr>
+        <w:u w:val="none"/>
+      </w:rPr>
+    </w:lvl>
+    <w:lvl w:ilvl="3">
+      <w:start w:val="1"/>
+      <w:numFmt w:val="bullet"/>
+      <w:lvlText w:val="●"/>
+      <w:lvlJc w:val="left"/>
+      <w:pPr>
+        <w:ind w:left="2880" w:hanging="360"/>
+      </w:pPr>
+      <w:rPr>
+        <w:u w:val="none"/>
+      </w:rPr>
+    </w:lvl>
+    <w:lvl w:ilvl="4">
+      <w:start w:val="1"/>
+      <w:numFmt w:val="bullet"/>
+      <w:lvlText w:val="○"/>
+      <w:lvlJc w:val="left"/>
+      <w:pPr>
+        <w:ind w:left="3600" w:hanging="360"/>
+      </w:pPr>
+      <w:rPr>
+        <w:u w:val="none"/>
+      </w:rPr>
+    </w:lvl>
+    <w:lvl w:ilvl="5">
+      <w:start w:val="1"/>
+      <w:numFmt w:val="bullet"/>
+      <w:lvlText w:val="■"/>
+      <w:lvlJc w:val="left"/>
+      <w:pPr>
+        <w:ind w:left="4320" w:hanging="360"/>
+      </w:pPr>
+      <w:rPr>
+        <w:u w:val="none"/>
+      </w:rPr>
+    </w:lvl>
+    <w:lvl w:ilvl="6">
+      <w:start w:val="1"/>
+      <w:numFmt w:val="bullet"/>
+      <w:lvlText w:val="●"/>
+      <w:lvlJc w:val="left"/>
+      <w:pPr>
+        <w:ind w:left="5040" w:hanging="360"/>
+      </w:pPr>
+      <w:rPr>
+        <w:u w:val="none"/>
+      </w:rPr>
+    </w:lvl>
+    <w:lvl w:ilvl="7">
+      <w:start w:val="1"/>
+      <w:numFmt w:val="bullet"/>
+      <w:lvlText w:val="○"/>
+      <w:lvlJc w:val="left"/>
+      <w:pPr>
+        <w:ind w:left="5760" w:hanging="360"/>
+      </w:pPr>
+      <w:rPr>
+        <w:u w:val="none"/>
+      </w:rPr>
+    </w:lvl>
+    <w:lvl w:ilvl="8">
+      <w:start w:val="1"/>
+      <w:numFmt w:val="bullet"/>
+      <w:lvlText w:val="■"/>
+      <w:lvlJc w:val="left"/>
+      <w:pPr>
+        <w:ind w:left="6480" w:hanging="360"/>
+      </w:pPr>
+      <w:rPr>
+        <w:u w:val="none"/>
+      </w:rPr>
+    </w:lvl>
+  </w:abstractNum>
+  <w:abstractNum w:abstractNumId="12">
+    <w:lvl w:ilvl="0">
+      <w:start w:val="1"/>
+      <w:numFmt w:val="bullet"/>
+      <w:lvlText w:val="-"/>
+      <w:lvlJc w:val="left"/>
+      <w:pPr>
+        <w:ind w:left="2160" w:hanging="360"/>
+      </w:pPr>
+      <w:rPr>
+        <w:u w:val="none"/>
+      </w:rPr>
+    </w:lvl>
+    <w:lvl w:ilvl="1">
+      <w:start w:val="1"/>
+      <w:numFmt w:val="bullet"/>
+      <w:lvlText w:val="-"/>
+      <w:lvlJc w:val="left"/>
+      <w:pPr>
+        <w:ind w:left="2880" w:hanging="360"/>
+      </w:pPr>
+      <w:rPr>
+        <w:u w:val="none"/>
+      </w:rPr>
+    </w:lvl>
+    <w:lvl w:ilvl="2">
+      <w:start w:val="1"/>
+      <w:numFmt w:val="bullet"/>
+      <w:lvlText w:val="-"/>
+      <w:lvlJc w:val="left"/>
+      <w:pPr>
+        <w:ind w:left="3600" w:hanging="360"/>
+      </w:pPr>
+      <w:rPr>
+        <w:u w:val="none"/>
+      </w:rPr>
+    </w:lvl>
+    <w:lvl w:ilvl="3">
+      <w:start w:val="1"/>
+      <w:numFmt w:val="bullet"/>
+      <w:lvlText w:val="-"/>
+      <w:lvlJc w:val="left"/>
+      <w:pPr>
+        <w:ind w:left="4320" w:hanging="360"/>
+      </w:pPr>
+      <w:rPr>
+        <w:u w:val="none"/>
+      </w:rPr>
+    </w:lvl>
+    <w:lvl w:ilvl="4">
+      <w:start w:val="1"/>
+      <w:numFmt w:val="bullet"/>
+      <w:lvlText w:val="-"/>
+      <w:lvlJc w:val="left"/>
+      <w:pPr>
+        <w:ind w:left="5040" w:hanging="360"/>
+      </w:pPr>
+      <w:rPr>
+        <w:u w:val="none"/>
+      </w:rPr>
+    </w:lvl>
+    <w:lvl w:ilvl="5">
+      <w:start w:val="1"/>
+      <w:numFmt w:val="bullet"/>
+      <w:lvlText w:val="-"/>
+      <w:lvlJc w:val="left"/>
+      <w:pPr>
+        <w:ind w:left="5760" w:hanging="360"/>
+      </w:pPr>
+      <w:rPr>
+        <w:u w:val="none"/>
+      </w:rPr>
+    </w:lvl>
+    <w:lvl w:ilvl="6">
+      <w:start w:val="1"/>
+      <w:numFmt w:val="bullet"/>
+      <w:lvlText w:val="-"/>
+      <w:lvlJc w:val="left"/>
+      <w:pPr>
+        <w:ind w:left="6480" w:hanging="360"/>
+      </w:pPr>
+      <w:rPr>
+        <w:u w:val="none"/>
+      </w:rPr>
+    </w:lvl>
+    <w:lvl w:ilvl="7">
+      <w:start w:val="1"/>
+      <w:numFmt w:val="bullet"/>
+      <w:lvlText w:val="-"/>
+      <w:lvlJc w:val="left"/>
+      <w:pPr>
+        <w:ind w:left="7200" w:hanging="360"/>
+      </w:pPr>
+      <w:rPr>
+        <w:u w:val="none"/>
+      </w:rPr>
+    </w:lvl>
+    <w:lvl w:ilvl="8">
+      <w:start w:val="1"/>
+      <w:numFmt w:val="bullet"/>
+      <w:lvlText w:val="-"/>
+      <w:lvlJc w:val="left"/>
+      <w:pPr>
+        <w:ind w:left="7920" w:hanging="360"/>
+      </w:pPr>
+      <w:rPr>
+        <w:u w:val="none"/>
       </w:rPr>
     </w:lvl>
   </w:abstractNum>
@@ -10130,6 +11197,21 @@
   </w:num>
   <w:num w:numId="7">
     <w:abstractNumId w:val="7"/>
+  </w:num>
+  <w:num w:numId="8">
+    <w:abstractNumId w:val="8"/>
+  </w:num>
+  <w:num w:numId="9">
+    <w:abstractNumId w:val="9"/>
+  </w:num>
+  <w:num w:numId="10">
+    <w:abstractNumId w:val="10"/>
+  </w:num>
+  <w:num w:numId="11">
+    <w:abstractNumId w:val="11"/>
+  </w:num>
+  <w:num w:numId="12">
+    <w:abstractNumId w:val="12"/>
   </w:num>
 </w:numbering>
 </file>
@@ -10286,6 +11368,20 @@
       <w:sz w:val="72"/>
       <w:szCs w:val="72"/>
     </w:rPr>
+  </w:style>
+  <w:style w:type="table" w:styleId="TableNormal" w:default="1">
+    <w:name w:val="TableNormal"/>
+    <w:tblPr>
+      <w:tblCellMar>
+        <w:top w:w="100.0" w:type="dxa"/>
+        <w:left w:w="100.0" w:type="dxa"/>
+        <w:bottom w:w="100.0" w:type="dxa"/>
+        <w:right w:w="100.0" w:type="dxa"/>
+      </w:tblCellMar>
+    </w:tblPr>
+  </w:style>
+  <w:style w:type="paragraph" w:styleId="Normal" w:default="1">
+    <w:name w:val="normal"/>
   </w:style>
   <w:style w:type="character" w:styleId="Fuentedeprrafopredeter" w:default="1">
     <w:name w:val="Default Paragraph Font"/>
@@ -10717,6 +11813,74 @@
     <w:basedOn w:val="Fuentedeprrafopredeter"/>
     <w:rsid w:val="0027225D"/>
   </w:style>
+  <w:style w:type="table" w:styleId="Table1">
+    <w:basedOn w:val="TableNormal"/>
+    <w:tblPr>
+      <w:tblStyleRowBandSize w:val="1"/>
+      <w:tblStyleColBandSize w:val="1"/>
+      <w:tblCellMar>
+        <w:top w:w="0.0" w:type="dxa"/>
+        <w:left w:w="115.0" w:type="dxa"/>
+        <w:bottom w:w="0.0" w:type="dxa"/>
+        <w:right w:w="115.0" w:type="dxa"/>
+      </w:tblCellMar>
+    </w:tblPr>
+  </w:style>
+  <w:style w:type="table" w:styleId="Table2">
+    <w:basedOn w:val="TableNormal"/>
+    <w:tblPr>
+      <w:tblStyleRowBandSize w:val="1"/>
+      <w:tblStyleColBandSize w:val="1"/>
+      <w:tblCellMar>
+        <w:top w:w="0.0" w:type="dxa"/>
+        <w:left w:w="115.0" w:type="dxa"/>
+        <w:bottom w:w="0.0" w:type="dxa"/>
+        <w:right w:w="115.0" w:type="dxa"/>
+      </w:tblCellMar>
+    </w:tblPr>
+  </w:style>
+  <w:style w:type="table" w:styleId="Table3">
+    <w:basedOn w:val="TableNormal"/>
+    <w:pPr>
+      <w:spacing w:after="0" w:line="240" w:lineRule="auto"/>
+    </w:pPr>
+    <w:rPr>
+      <w:rFonts w:ascii="Times New Roman" w:cs="Times New Roman" w:eastAsia="Times New Roman" w:hAnsi="Times New Roman"/>
+      <w:sz w:val="20"/>
+      <w:szCs w:val="20"/>
+    </w:rPr>
+    <w:tblPr>
+      <w:tblStyleRowBandSize w:val="1"/>
+      <w:tblStyleColBandSize w:val="1"/>
+      <w:tblCellMar>
+        <w:top w:w="0.0" w:type="dxa"/>
+        <w:left w:w="108.0" w:type="dxa"/>
+        <w:bottom w:w="0.0" w:type="dxa"/>
+        <w:right w:w="108.0" w:type="dxa"/>
+      </w:tblCellMar>
+    </w:tblPr>
+  </w:style>
+  <w:style w:type="table" w:styleId="Table4">
+    <w:basedOn w:val="TableNormal"/>
+    <w:pPr>
+      <w:spacing w:after="0" w:line="240" w:lineRule="auto"/>
+    </w:pPr>
+    <w:rPr>
+      <w:rFonts w:ascii="Times New Roman" w:cs="Times New Roman" w:eastAsia="Times New Roman" w:hAnsi="Times New Roman"/>
+      <w:sz w:val="20"/>
+      <w:szCs w:val="20"/>
+    </w:rPr>
+    <w:tblPr>
+      <w:tblStyleRowBandSize w:val="1"/>
+      <w:tblStyleColBandSize w:val="1"/>
+      <w:tblCellMar>
+        <w:top w:w="0.0" w:type="dxa"/>
+        <w:left w:w="108.0" w:type="dxa"/>
+        <w:bottom w:w="0.0" w:type="dxa"/>
+        <w:right w:w="108.0" w:type="dxa"/>
+      </w:tblCellMar>
+    </w:tblPr>
+  </w:style>
   <w:style w:type="paragraph" w:styleId="Subtitle">
     <w:name w:val="Subtitle"/>
     <w:basedOn w:val="Normal"/>

</xml_diff>